<commit_message>
Update proposal and experiment plan for structured router
</commit_message>
<xml_diff>
--- a/docs/proposal.docx
+++ b/docs/proposal.docx
@@ -198,7 +198,7 @@
         <w:rPr>
           <w:lang w:eastAsia="ko-KR"/>
         </w:rPr>
-        <w:t xml:space="preserve">9차 수정본 2026년 10월 7일</w:t>
+        <w:t xml:space="preserve">10차 수정본 2026년 10월 7일</w:t>
       </w:r>
     </w:p>
     <w:p>
@@ -211,7 +211,7 @@
         <w:rPr>
           <w:lang w:eastAsia="ko-KR"/>
         </w:rPr>
-        <w:t xml:space="preserve">구현·실험 반영 기준: main 9cdcbd4 (2026년 10월 7일)</w:t>
+        <w:t xml:space="preserve">구현·실험 기준: main 6d3acf3 / 다음 모델 구성·학습 계획 반영</w:t>
       </w:r>
     </w:p>
     <w:p>
@@ -1488,7 +1488,7 @@
         <w:rPr>
           <w:lang w:eastAsia="ko-KR"/>
         </w:rPr>
-        <w:t xml:space="preserve">평가는 문서 해석과 정보 요청, 응답 후 상태 갱신 및 발주 의사결정의 연결을 대상으로 한다. 영어 계약·규칙·대화·재무 문서·판매 기록의 6개 공개 과제로 각 능력을 학습·평가하고, 연결된 주문 DB와 정책을 가진 τ²-bench retail에서 전체 대화를 비교한다. 공개 과제의 5개 seed CPU 학습·평가는 완료했으며, 같은 Qwen 7B를 사용하는 typed·agent 비교와 주문 대화 평가는 GPU 실행을 남겨 두었다. 기본 Newsvendor 사례에서는 순회수가치와 추가 shortage cost의 순차 요청 가치를 계산한다.</w:t>
+        <w:t xml:space="preserve">평가는 문서 해석과 정보 요청, 응답 후 상태 갱신 및 발주 의사결정의 연결을 대상으로 한다. 영어 계약·규칙·대화·재무 문서·판매 기록의 6개 공개 과제에서 5개 seed의 기존 CPU 학습·평가를 완료했다. 다음 모델은 ModernBERT-base와 시계열 encoder를 학습 가능한 연구 head에 연결하고, 도구 인자와 질문 대상을 내부에서 구조화해 출력한다. 고정 typed·agent 비교와 연결된 τ² retail 대화에서는 같은 원문·도구·검증 조건을 사용한다. 현재 GPU runner는 기존 Qwen 보조 모델의 비교 경로이며, 새 모델의 구현·GPU 학습과 평가는 7절의 다음 실행 계획이다.</w:t>
       </w:r>
     </w:p>
     <w:p>
@@ -7643,7 +7643,7 @@
         <w:rPr>
           <w:lang w:eastAsia="ko-KR"/>
         </w:rPr>
-        <w:t xml:space="preserve">Jev는 TypeSafe AI의 구조화 예측 모델·API이고 [12], open-alternative-jev는 공개 LM을 이용한 독립 구현이다 [13]. SGLang의 decision API [15]와 encoder·head 구조의 Laya [14]도 구조화 판단의 구현 사례이다. 이번 주 비교 모델은 revision을 고정한 Qwen2.5-7B-Instruct [33]로 통일한다. 고정 typed 파이프라인과 agent, 학습형 router의 언어 표현 보조에 같은 가중치를 사용하여 입력 처리와 행동 선택의 차이를 비교한다. Jev·SGLang endpoint 연동은 별도 실행 경로로 유지한다.</w:t>
+        <w:t xml:space="preserve">Jev는 TypeSafe AI의 구조화 예측 모델·API이고 [12], open-alternative-jev는 공개 LM을 이용한 독립 구현이다 [13]. SGLang의 decision API [15]와 encoder·head 구조의 Laya [14]도 구조화 판단의 구현 사례이다. 현재 GPU runner는 고정 revision의 Qwen2.5-7B-Instruct [33]를 typed·agent 비교군, 기존 학습형의 인자·발화 보조 및 공통 대화 환경에 사용한다. 제안 모델의 backbone은 ModernBERT [35]이며, 연구 head와 공유 인자 추출 모듈이 구조화 출력을 직접 작성한다. Qwen은 비교군과 사용자 simulator·참고 judge에 유지하고, 제안 학습형 추론의 필수 모듈로 사용하지 않는다.</w:t>
       </w:r>
     </w:p>
     <w:p>
@@ -7657,805 +7657,7 @@
         <w:rPr>
           <w:lang w:eastAsia="ko-KR"/>
         </w:rPr>
-        <w:t>Encoder</w:t>
-      </w:r>
-      <w:r>
-        <w:rPr>
-          <w:lang w:eastAsia="ko-KR"/>
-        </w:rPr>
-        <w:t>는</w:t>
-      </w:r>
-      <w:r>
-        <w:rPr>
-          <w:lang w:eastAsia="ko-KR"/>
-        </w:rPr>
-        <w:t xml:space="preserve"> </w:t>
-      </w:r>
-      <w:r>
-        <w:rPr>
-          <w:lang w:eastAsia="ko-KR"/>
-        </w:rPr>
-        <w:t>문장이나</w:t>
-      </w:r>
-      <w:r>
-        <w:rPr>
-          <w:lang w:eastAsia="ko-KR"/>
-        </w:rPr>
-        <w:t xml:space="preserve"> </w:t>
-      </w:r>
-      <w:r>
-        <w:rPr>
-          <w:lang w:eastAsia="ko-KR"/>
-        </w:rPr>
-        <w:t>항목</w:t>
-      </w:r>
-      <w:r>
-        <w:rPr>
-          <w:lang w:eastAsia="ko-KR"/>
-        </w:rPr>
-        <w:t xml:space="preserve"> </w:t>
-      </w:r>
-      <w:r>
-        <w:rPr>
-          <w:lang w:eastAsia="ko-KR"/>
-        </w:rPr>
-        <w:t>설명을</w:t>
-      </w:r>
-      <w:r>
-        <w:rPr>
-          <w:lang w:eastAsia="ko-KR"/>
-        </w:rPr>
-        <w:t xml:space="preserve"> </w:t>
-      </w:r>
-      <w:r>
-        <w:rPr>
-          <w:lang w:eastAsia="ko-KR"/>
-        </w:rPr>
-        <w:t>계산에</w:t>
-      </w:r>
-      <w:r>
-        <w:rPr>
-          <w:lang w:eastAsia="ko-KR"/>
-        </w:rPr>
-        <w:t xml:space="preserve"> </w:t>
-      </w:r>
-      <w:r>
-        <w:rPr>
-          <w:lang w:eastAsia="ko-KR"/>
-        </w:rPr>
-        <w:t>쓸</w:t>
-      </w:r>
-      <w:r>
-        <w:rPr>
-          <w:lang w:eastAsia="ko-KR"/>
-        </w:rPr>
-        <w:t xml:space="preserve"> </w:t>
-      </w:r>
-      <w:r>
-        <w:rPr>
-          <w:lang w:eastAsia="ko-KR"/>
-        </w:rPr>
-        <w:t>수</w:t>
-      </w:r>
-      <w:r>
-        <w:rPr>
-          <w:lang w:eastAsia="ko-KR"/>
-        </w:rPr>
-        <w:t xml:space="preserve"> </w:t>
-      </w:r>
-      <w:r>
-        <w:rPr>
-          <w:lang w:eastAsia="ko-KR"/>
-        </w:rPr>
-        <w:t>있는</w:t>
-      </w:r>
-      <w:r>
-        <w:rPr>
-          <w:lang w:eastAsia="ko-KR"/>
-        </w:rPr>
-        <w:t xml:space="preserve"> </w:t>
-      </w:r>
-      <w:r>
-        <w:rPr>
-          <w:lang w:eastAsia="ko-KR"/>
-        </w:rPr>
-        <w:t>숫자</w:t>
-      </w:r>
-      <w:r>
-        <w:rPr>
-          <w:lang w:eastAsia="ko-KR"/>
-        </w:rPr>
-        <w:t xml:space="preserve"> </w:t>
-      </w:r>
-      <w:r>
-        <w:rPr>
-          <w:lang w:eastAsia="ko-KR"/>
-        </w:rPr>
-        <w:t>배열</w:t>
-      </w:r>
-      <w:r>
-        <w:rPr>
-          <w:lang w:eastAsia="ko-KR"/>
-        </w:rPr>
-        <w:t>(vector)</w:t>
-      </w:r>
-      <w:r>
-        <w:rPr>
-          <w:lang w:eastAsia="ko-KR"/>
-        </w:rPr>
-        <w:t>로</w:t>
-      </w:r>
-      <w:r>
-        <w:rPr>
-          <w:lang w:eastAsia="ko-KR"/>
-        </w:rPr>
-        <w:t xml:space="preserve"> </w:t>
-      </w:r>
-      <w:r>
-        <w:rPr>
-          <w:lang w:eastAsia="ko-KR"/>
-        </w:rPr>
-        <w:t>바꾸는</w:t>
-      </w:r>
-      <w:r>
-        <w:rPr>
-          <w:lang w:eastAsia="ko-KR"/>
-        </w:rPr>
-        <w:t xml:space="preserve"> </w:t>
-      </w:r>
-      <w:r>
-        <w:rPr>
-          <w:lang w:eastAsia="ko-KR"/>
-        </w:rPr>
-        <w:t>모델이다</w:t>
-      </w:r>
-      <w:r>
-        <w:rPr>
-          <w:lang w:eastAsia="ko-KR"/>
-        </w:rPr>
-        <w:t xml:space="preserve">. </w:t>
-      </w:r>
-      <w:r>
-        <w:rPr>
-          <w:lang w:eastAsia="ko-KR"/>
-        </w:rPr>
-        <w:t>이</w:t>
-      </w:r>
-      <w:r>
-        <w:rPr>
-          <w:lang w:eastAsia="ko-KR"/>
-        </w:rPr>
-        <w:t xml:space="preserve"> </w:t>
-      </w:r>
-      <w:r>
-        <w:rPr>
-          <w:lang w:eastAsia="ko-KR"/>
-        </w:rPr>
-        <w:t>숫자</w:t>
-      </w:r>
-      <w:r>
-        <w:rPr>
-          <w:lang w:eastAsia="ko-KR"/>
-        </w:rPr>
-        <w:t xml:space="preserve"> </w:t>
-      </w:r>
-      <w:r>
-        <w:rPr>
-          <w:lang w:eastAsia="ko-KR"/>
-        </w:rPr>
-        <w:t>표현을</w:t>
-      </w:r>
-      <w:r>
-        <w:rPr>
-          <w:lang w:eastAsia="ko-KR"/>
-        </w:rPr>
-        <w:t xml:space="preserve"> embedding</w:t>
-      </w:r>
-      <w:r>
-        <w:rPr>
-          <w:lang w:eastAsia="ko-KR"/>
-        </w:rPr>
-        <w:t>이라</w:t>
-      </w:r>
-      <w:r>
-        <w:rPr>
-          <w:lang w:eastAsia="ko-KR"/>
-        </w:rPr>
-        <w:t xml:space="preserve"> </w:t>
-      </w:r>
-      <w:r>
-        <w:rPr>
-          <w:lang w:eastAsia="ko-KR"/>
-        </w:rPr>
-        <w:t>부른다</w:t>
-      </w:r>
-      <w:r>
-        <w:rPr>
-          <w:lang w:eastAsia="ko-KR"/>
-        </w:rPr>
-        <w:t>. Head</w:t>
-      </w:r>
-      <w:r>
-        <w:rPr>
-          <w:lang w:eastAsia="ko-KR"/>
-        </w:rPr>
-        <w:t>는</w:t>
-      </w:r>
-      <w:r>
-        <w:rPr>
-          <w:lang w:eastAsia="ko-KR"/>
-        </w:rPr>
-        <w:t xml:space="preserve"> encoder</w:t>
-      </w:r>
-      <w:r>
-        <w:rPr>
-          <w:lang w:eastAsia="ko-KR"/>
-        </w:rPr>
-        <w:t>의</w:t>
-      </w:r>
-      <w:r>
-        <w:rPr>
-          <w:lang w:eastAsia="ko-KR"/>
-        </w:rPr>
-        <w:t xml:space="preserve"> </w:t>
-      </w:r>
-      <w:r>
-        <w:rPr>
-          <w:lang w:eastAsia="ko-KR"/>
-        </w:rPr>
-        <w:t>표현을</w:t>
-      </w:r>
-      <w:r>
-        <w:rPr>
-          <w:lang w:eastAsia="ko-KR"/>
-        </w:rPr>
-        <w:t xml:space="preserve"> </w:t>
-      </w:r>
-      <w:r>
-        <w:rPr>
-          <w:lang w:eastAsia="ko-KR"/>
-        </w:rPr>
-        <w:t>받아</w:t>
-      </w:r>
-      <w:r>
-        <w:rPr>
-          <w:lang w:eastAsia="ko-KR"/>
-        </w:rPr>
-        <w:t xml:space="preserve"> </w:t>
-      </w:r>
-      <w:r>
-        <w:rPr>
-          <w:lang w:eastAsia="ko-KR"/>
-        </w:rPr>
-        <w:t>특정</w:t>
-      </w:r>
-      <w:r>
-        <w:rPr>
-          <w:lang w:eastAsia="ko-KR"/>
-        </w:rPr>
-        <w:t xml:space="preserve"> </w:t>
-      </w:r>
-      <w:r>
-        <w:rPr>
-          <w:lang w:eastAsia="ko-KR"/>
-        </w:rPr>
-        <w:t>과제의</w:t>
-      </w:r>
-      <w:r>
-        <w:rPr>
-          <w:lang w:eastAsia="ko-KR"/>
-        </w:rPr>
-        <w:t xml:space="preserve"> </w:t>
-      </w:r>
-      <w:r>
-        <w:rPr>
-          <w:lang w:eastAsia="ko-KR"/>
-        </w:rPr>
-        <w:t>답을</w:t>
-      </w:r>
-      <w:r>
-        <w:rPr>
-          <w:lang w:eastAsia="ko-KR"/>
-        </w:rPr>
-        <w:t xml:space="preserve"> </w:t>
-      </w:r>
-      <w:r>
-        <w:rPr>
-          <w:lang w:eastAsia="ko-KR"/>
-        </w:rPr>
-        <w:t>출력하는</w:t>
-      </w:r>
-      <w:r>
-        <w:rPr>
-          <w:lang w:eastAsia="ko-KR"/>
-        </w:rPr>
-        <w:t xml:space="preserve"> </w:t>
-      </w:r>
-      <w:r>
-        <w:rPr>
-          <w:lang w:eastAsia="ko-KR"/>
-        </w:rPr>
-        <w:t>작은</w:t>
-      </w:r>
-      <w:r>
-        <w:rPr>
-          <w:lang w:eastAsia="ko-KR"/>
-        </w:rPr>
-        <w:t xml:space="preserve"> </w:t>
-      </w:r>
-      <w:r>
-        <w:rPr>
-          <w:lang w:eastAsia="ko-KR"/>
-        </w:rPr>
-        <w:t>계산</w:t>
-      </w:r>
-      <w:r>
-        <w:rPr>
-          <w:lang w:eastAsia="ko-KR"/>
-        </w:rPr>
-        <w:t xml:space="preserve"> </w:t>
-      </w:r>
-      <w:r>
-        <w:rPr>
-          <w:lang w:eastAsia="ko-KR"/>
-        </w:rPr>
-        <w:t>층이며</w:t>
-      </w:r>
-      <w:r>
-        <w:rPr>
-          <w:lang w:eastAsia="ko-KR"/>
-        </w:rPr>
-        <w:t>, MLP</w:t>
-      </w:r>
-      <w:r>
-        <w:rPr>
-          <w:lang w:eastAsia="ko-KR"/>
-        </w:rPr>
-        <w:t>는</w:t>
-      </w:r>
-      <w:r>
-        <w:rPr>
-          <w:lang w:eastAsia="ko-KR"/>
-        </w:rPr>
-        <w:t xml:space="preserve"> </w:t>
-      </w:r>
-      <w:r>
-        <w:rPr>
-          <w:lang w:eastAsia="ko-KR"/>
-        </w:rPr>
-        <w:t>여러</w:t>
-      </w:r>
-      <w:r>
-        <w:rPr>
-          <w:lang w:eastAsia="ko-KR"/>
-        </w:rPr>
-        <w:t xml:space="preserve"> </w:t>
-      </w:r>
-      <w:r>
-        <w:rPr>
-          <w:lang w:eastAsia="ko-KR"/>
-        </w:rPr>
-        <w:t>계산</w:t>
-      </w:r>
-      <w:r>
-        <w:rPr>
-          <w:lang w:eastAsia="ko-KR"/>
-        </w:rPr>
-        <w:t xml:space="preserve"> </w:t>
-      </w:r>
-      <w:r>
-        <w:rPr>
-          <w:lang w:eastAsia="ko-KR"/>
-        </w:rPr>
-        <w:t>층으로</w:t>
-      </w:r>
-      <w:r>
-        <w:rPr>
-          <w:lang w:eastAsia="ko-KR"/>
-        </w:rPr>
-        <w:t xml:space="preserve"> </w:t>
-      </w:r>
-      <w:r>
-        <w:rPr>
-          <w:lang w:eastAsia="ko-KR"/>
-        </w:rPr>
-        <w:t>이루어진</w:t>
-      </w:r>
-      <w:r>
-        <w:rPr>
-          <w:lang w:eastAsia="ko-KR"/>
-        </w:rPr>
-        <w:t xml:space="preserve"> </w:t>
-      </w:r>
-      <w:r>
-        <w:rPr>
-          <w:lang w:eastAsia="ko-KR"/>
-        </w:rPr>
-        <w:t>신경망으로</w:t>
-      </w:r>
-      <w:r>
-        <w:rPr>
-          <w:lang w:eastAsia="ko-KR"/>
-        </w:rPr>
-        <w:t xml:space="preserve"> head</w:t>
-      </w:r>
-      <w:proofErr w:type="spellStart"/>
-      <w:r>
-        <w:rPr>
-          <w:lang w:eastAsia="ko-KR"/>
-        </w:rPr>
-        <w:t>를</w:t>
-      </w:r>
-      <w:proofErr w:type="spellEnd"/>
-      <w:r>
-        <w:rPr>
-          <w:lang w:eastAsia="ko-KR"/>
-        </w:rPr>
-        <w:t xml:space="preserve"> </w:t>
-      </w:r>
-      <w:r>
-        <w:rPr>
-          <w:lang w:eastAsia="ko-KR"/>
-        </w:rPr>
-        <w:t>구현하는</w:t>
-      </w:r>
-      <w:r>
-        <w:rPr>
-          <w:lang w:eastAsia="ko-KR"/>
-        </w:rPr>
-        <w:t xml:space="preserve"> </w:t>
-      </w:r>
-      <w:r>
-        <w:rPr>
-          <w:lang w:eastAsia="ko-KR"/>
-        </w:rPr>
-        <w:t>데</w:t>
-      </w:r>
-      <w:r>
-        <w:rPr>
-          <w:lang w:eastAsia="ko-KR"/>
-        </w:rPr>
-        <w:t xml:space="preserve"> </w:t>
-      </w:r>
-      <w:r>
-        <w:rPr>
-          <w:lang w:eastAsia="ko-KR"/>
-        </w:rPr>
-        <w:t>사용한다</w:t>
-      </w:r>
-      <w:r>
-        <w:rPr>
-          <w:lang w:eastAsia="ko-KR"/>
-        </w:rPr>
-        <w:t xml:space="preserve">. </w:t>
-      </w:r>
-      <w:r>
-        <w:rPr>
-          <w:lang w:eastAsia="ko-KR"/>
-        </w:rPr>
-        <w:t>학습은</w:t>
-      </w:r>
-      <w:r>
-        <w:rPr>
-          <w:lang w:eastAsia="ko-KR"/>
-        </w:rPr>
-        <w:t xml:space="preserve"> </w:t>
-      </w:r>
-      <w:r>
-        <w:rPr>
-          <w:lang w:eastAsia="ko-KR"/>
-        </w:rPr>
-        <w:t>정답</w:t>
-      </w:r>
-      <w:r>
-        <w:rPr>
-          <w:lang w:eastAsia="ko-KR"/>
-        </w:rPr>
-        <w:t xml:space="preserve"> </w:t>
-      </w:r>
-      <w:r>
-        <w:rPr>
-          <w:lang w:eastAsia="ko-KR"/>
-        </w:rPr>
-        <w:t>주석과</w:t>
-      </w:r>
-      <w:r>
-        <w:rPr>
-          <w:lang w:eastAsia="ko-KR"/>
-        </w:rPr>
-        <w:t xml:space="preserve"> </w:t>
-      </w:r>
-      <w:r>
-        <w:rPr>
-          <w:lang w:eastAsia="ko-KR"/>
-        </w:rPr>
-        <w:t>예측의</w:t>
-      </w:r>
-      <w:r>
-        <w:rPr>
-          <w:lang w:eastAsia="ko-KR"/>
-        </w:rPr>
-        <w:t xml:space="preserve"> </w:t>
-      </w:r>
-      <w:r>
-        <w:rPr>
-          <w:lang w:eastAsia="ko-KR"/>
-        </w:rPr>
-        <w:t>차이를</w:t>
-      </w:r>
-      <w:r>
-        <w:rPr>
-          <w:lang w:eastAsia="ko-KR"/>
-        </w:rPr>
-        <w:t xml:space="preserve"> </w:t>
-      </w:r>
-      <w:r>
-        <w:rPr>
-          <w:lang w:eastAsia="ko-KR"/>
-        </w:rPr>
-        <w:t>줄이도록</w:t>
-      </w:r>
-      <w:r>
-        <w:rPr>
-          <w:lang w:eastAsia="ko-KR"/>
-        </w:rPr>
-        <w:t xml:space="preserve"> </w:t>
-      </w:r>
-      <w:r>
-        <w:rPr>
-          <w:lang w:eastAsia="ko-KR"/>
-        </w:rPr>
-        <w:t>파라미터를</w:t>
-      </w:r>
-      <w:r>
-        <w:rPr>
-          <w:lang w:eastAsia="ko-KR"/>
-        </w:rPr>
-        <w:t xml:space="preserve"> </w:t>
-      </w:r>
-      <w:r>
-        <w:rPr>
-          <w:lang w:eastAsia="ko-KR"/>
-        </w:rPr>
-        <w:t>바꾸는</w:t>
-      </w:r>
-      <w:r>
-        <w:rPr>
-          <w:lang w:eastAsia="ko-KR"/>
-        </w:rPr>
-        <w:t xml:space="preserve"> </w:t>
-      </w:r>
-      <w:r>
-        <w:rPr>
-          <w:lang w:eastAsia="ko-KR"/>
-        </w:rPr>
-        <w:t>과정이고</w:t>
-      </w:r>
-      <w:r>
-        <w:rPr>
-          <w:lang w:eastAsia="ko-KR"/>
-        </w:rPr>
-        <w:t xml:space="preserve">, </w:t>
-      </w:r>
-      <w:r>
-        <w:rPr>
-          <w:lang w:eastAsia="ko-KR"/>
-        </w:rPr>
-        <w:t>추론은</w:t>
-      </w:r>
-      <w:r>
-        <w:rPr>
-          <w:lang w:eastAsia="ko-KR"/>
-        </w:rPr>
-        <w:t xml:space="preserve"> </w:t>
-      </w:r>
-      <w:r>
-        <w:rPr>
-          <w:lang w:eastAsia="ko-KR"/>
-        </w:rPr>
-        <w:t>학습한</w:t>
-      </w:r>
-      <w:r>
-        <w:rPr>
-          <w:lang w:eastAsia="ko-KR"/>
-        </w:rPr>
-        <w:t xml:space="preserve"> </w:t>
-      </w:r>
-      <w:r>
-        <w:rPr>
-          <w:lang w:eastAsia="ko-KR"/>
-        </w:rPr>
-        <w:t>모델로</w:t>
-      </w:r>
-      <w:r>
-        <w:rPr>
-          <w:lang w:eastAsia="ko-KR"/>
-        </w:rPr>
-        <w:t xml:space="preserve"> </w:t>
-      </w:r>
-      <w:r>
-        <w:rPr>
-          <w:lang w:eastAsia="ko-KR"/>
-        </w:rPr>
-        <w:t>새</w:t>
-      </w:r>
-      <w:r>
-        <w:rPr>
-          <w:lang w:eastAsia="ko-KR"/>
-        </w:rPr>
-        <w:t xml:space="preserve"> </w:t>
-      </w:r>
-      <w:r>
-        <w:rPr>
-          <w:lang w:eastAsia="ko-KR"/>
-        </w:rPr>
-        <w:t>입력의</w:t>
-      </w:r>
-      <w:r>
-        <w:rPr>
-          <w:lang w:eastAsia="ko-KR"/>
-        </w:rPr>
-        <w:t xml:space="preserve"> </w:t>
-      </w:r>
-      <w:r>
-        <w:rPr>
-          <w:lang w:eastAsia="ko-KR"/>
-        </w:rPr>
-        <w:t>결과를</w:t>
-      </w:r>
-      <w:r>
-        <w:rPr>
-          <w:lang w:eastAsia="ko-KR"/>
-        </w:rPr>
-        <w:t xml:space="preserve"> </w:t>
-      </w:r>
-      <w:r>
-        <w:rPr>
-          <w:lang w:eastAsia="ko-KR"/>
-        </w:rPr>
-        <w:t>계산하는</w:t>
-      </w:r>
-      <w:r>
-        <w:rPr>
-          <w:lang w:eastAsia="ko-KR"/>
-        </w:rPr>
-        <w:t xml:space="preserve"> </w:t>
-      </w:r>
-      <w:r>
-        <w:rPr>
-          <w:lang w:eastAsia="ko-KR"/>
-        </w:rPr>
-        <w:t>과정이다</w:t>
-      </w:r>
-      <w:r>
-        <w:rPr>
-          <w:lang w:eastAsia="ko-KR"/>
-        </w:rPr>
-        <w:t xml:space="preserve">. </w:t>
-      </w:r>
-      <w:r>
-        <w:rPr>
-          <w:lang w:eastAsia="ko-KR"/>
-        </w:rPr>
-        <w:t>학습형</w:t>
-      </w:r>
-      <w:r>
-        <w:rPr>
-          <w:lang w:eastAsia="ko-KR"/>
-        </w:rPr>
-        <w:t xml:space="preserve"> router</w:t>
-      </w:r>
-      <w:r>
-        <w:rPr>
-          <w:lang w:eastAsia="ko-KR"/>
-        </w:rPr>
-        <w:t>는</w:t>
-      </w:r>
-      <w:r>
-        <w:rPr>
-          <w:lang w:eastAsia="ko-KR"/>
-        </w:rPr>
-        <w:t xml:space="preserve"> </w:t>
-      </w:r>
-      <w:proofErr w:type="spellStart"/>
-      <w:r>
-        <w:rPr>
-          <w:lang w:eastAsia="ko-KR"/>
-        </w:rPr>
-        <w:t>사전학습된</w:t>
-      </w:r>
-      <w:proofErr w:type="spellEnd"/>
-      <w:r>
-        <w:rPr>
-          <w:lang w:eastAsia="ko-KR"/>
-        </w:rPr>
-        <w:t xml:space="preserve"> encoder(pre-trained encoder)</w:t>
-      </w:r>
-      <w:r>
-        <w:rPr>
-          <w:lang w:eastAsia="ko-KR"/>
-        </w:rPr>
-        <w:t>의</w:t>
-      </w:r>
-      <w:r>
-        <w:rPr>
-          <w:lang w:eastAsia="ko-KR"/>
-        </w:rPr>
-        <w:t xml:space="preserve"> </w:t>
-      </w:r>
-      <w:r>
-        <w:rPr>
-          <w:lang w:eastAsia="ko-KR"/>
-        </w:rPr>
-        <w:t>가중치를</w:t>
-      </w:r>
-      <w:r>
-        <w:rPr>
-          <w:lang w:eastAsia="ko-KR"/>
-        </w:rPr>
-        <w:t xml:space="preserve"> </w:t>
-      </w:r>
-      <w:r>
-        <w:rPr>
-          <w:lang w:eastAsia="ko-KR"/>
-        </w:rPr>
-        <w:t>고정한</w:t>
-      </w:r>
-      <w:r>
-        <w:rPr>
-          <w:lang w:eastAsia="ko-KR"/>
-        </w:rPr>
-        <w:t xml:space="preserve"> </w:t>
-      </w:r>
-      <w:r>
-        <w:rPr>
-          <w:lang w:eastAsia="ko-KR"/>
-        </w:rPr>
-        <w:t>채</w:t>
-      </w:r>
-      <w:r>
-        <w:rPr>
-          <w:lang w:eastAsia="ko-KR"/>
-        </w:rPr>
-        <w:t xml:space="preserve"> </w:t>
-      </w:r>
-      <w:r>
-        <w:rPr>
-          <w:lang w:eastAsia="ko-KR"/>
-        </w:rPr>
-        <w:t>업무별</w:t>
-      </w:r>
-      <w:r>
-        <w:rPr>
-          <w:lang w:eastAsia="ko-KR"/>
-        </w:rPr>
-        <w:t xml:space="preserve"> head</w:t>
-      </w:r>
-      <w:proofErr w:type="spellStart"/>
-      <w:r>
-        <w:rPr>
-          <w:lang w:eastAsia="ko-KR"/>
-        </w:rPr>
-        <w:t>를</w:t>
-      </w:r>
-      <w:proofErr w:type="spellEnd"/>
-      <w:r>
-        <w:rPr>
-          <w:lang w:eastAsia="ko-KR"/>
-        </w:rPr>
-        <w:t xml:space="preserve"> </w:t>
-      </w:r>
-      <w:r>
-        <w:rPr>
-          <w:lang w:eastAsia="ko-KR"/>
-        </w:rPr>
-        <w:t>학습한다</w:t>
-      </w:r>
-      <w:r>
-        <w:rPr>
-          <w:lang w:eastAsia="ko-KR"/>
-        </w:rPr>
-        <w:t>.</w:t>
+        <w:t xml:space="preserve">Encoder는 입력 token을 계산에 사용할 숫자 배열(vector)로 바꾸는 모델이며, 그 표현을 embedding이라 부른다. Head는 token·slot·상태 표현에서 특정 판단이나 값을 출력하는 계산 층이고, MLP는 이를 구현하는 신경망이다. 학습은 원래 주석이나 관측 결과와 예측의 차이를 줄이도록 파라미터를 바꾸는 과정이며, 추론은 새 입력에 학습한 모델을 적용하는 과정이다. 완료한 기존 구현은 MiniLM을 고정하고 head만 학습했다. 다음 모델은 ModernBERT의 token 표현을 보존하고 encoder와 head를 함께 미세조정한다.</w:t>
       </w:r>
     </w:p>
     <w:p>
@@ -8465,781 +7667,11 @@
           <w:lang w:eastAsia="ko-KR"/>
         </w:rPr>
       </w:pPr>
-      <w:proofErr w:type="spellStart"/>
-      <w:r>
-        <w:rPr>
-          <w:lang w:eastAsia="ko-KR"/>
-        </w:rPr>
-        <w:t>모수</w:t>
-      </w:r>
-      <w:proofErr w:type="spellEnd"/>
-      <w:r>
-        <w:rPr>
-          <w:lang w:eastAsia="ko-KR"/>
-        </w:rPr>
-        <w:t xml:space="preserve"> </w:t>
-      </w:r>
-      <w:r>
-        <w:rPr>
-          <w:lang w:eastAsia="ko-KR"/>
-        </w:rPr>
-        <w:t>상태</w:t>
-      </w:r>
-      <w:r>
-        <w:rPr>
-          <w:lang w:eastAsia="ko-KR"/>
-        </w:rPr>
-        <w:t>(parameter state, B)</w:t>
-      </w:r>
-      <w:r>
-        <w:rPr>
-          <w:lang w:eastAsia="ko-KR"/>
-        </w:rPr>
-        <w:t>는</w:t>
-      </w:r>
-      <w:r>
-        <w:rPr>
-          <w:lang w:eastAsia="ko-KR"/>
-        </w:rPr>
-        <w:t xml:space="preserve"> </w:t>
-      </w:r>
-      <w:proofErr w:type="spellStart"/>
-      <w:r>
-        <w:rPr>
-          <w:lang w:eastAsia="ko-KR"/>
-        </w:rPr>
-        <w:t>모수별</w:t>
-      </w:r>
-      <w:proofErr w:type="spellEnd"/>
-      <w:r>
-        <w:rPr>
-          <w:lang w:eastAsia="ko-KR"/>
-        </w:rPr>
-        <w:t xml:space="preserve"> </w:t>
-      </w:r>
-      <w:r>
-        <w:rPr>
-          <w:lang w:eastAsia="ko-KR"/>
-        </w:rPr>
-        <w:t>값</w:t>
-      </w:r>
-      <w:r>
-        <w:rPr>
-          <w:lang w:eastAsia="ko-KR"/>
-        </w:rPr>
-        <w:t>·</w:t>
-      </w:r>
-      <w:r>
-        <w:rPr>
-          <w:lang w:eastAsia="ko-KR"/>
-        </w:rPr>
-        <w:t>허용</w:t>
-      </w:r>
-      <w:r>
-        <w:rPr>
-          <w:lang w:eastAsia="ko-KR"/>
-        </w:rPr>
-        <w:t xml:space="preserve"> </w:t>
-      </w:r>
-      <w:r>
-        <w:rPr>
-          <w:lang w:eastAsia="ko-KR"/>
-        </w:rPr>
-        <w:t>범위</w:t>
-      </w:r>
-      <w:r>
-        <w:rPr>
-          <w:lang w:eastAsia="ko-KR"/>
-        </w:rPr>
-        <w:t>·</w:t>
-      </w:r>
-      <w:r>
-        <w:rPr>
-          <w:lang w:eastAsia="ko-KR"/>
-        </w:rPr>
-        <w:t>분포</w:t>
-      </w:r>
-      <w:r>
-        <w:rPr>
-          <w:lang w:eastAsia="ko-KR"/>
-        </w:rPr>
-        <w:t xml:space="preserve">, </w:t>
-      </w:r>
-      <w:r>
-        <w:rPr>
-          <w:lang w:eastAsia="ko-KR"/>
-        </w:rPr>
-        <w:t>근거</w:t>
-      </w:r>
-      <w:r>
-        <w:rPr>
-          <w:lang w:eastAsia="ko-KR"/>
-        </w:rPr>
-        <w:t xml:space="preserve"> </w:t>
-      </w:r>
-      <w:r>
-        <w:rPr>
-          <w:lang w:eastAsia="ko-KR"/>
-        </w:rPr>
-        <w:t>위치</w:t>
-      </w:r>
-      <w:r>
-        <w:rPr>
-          <w:lang w:eastAsia="ko-KR"/>
-        </w:rPr>
-        <w:t xml:space="preserve">, </w:t>
-      </w:r>
-      <w:r>
-        <w:rPr>
-          <w:lang w:eastAsia="ko-KR"/>
-        </w:rPr>
-        <w:t>단위</w:t>
-      </w:r>
-      <w:r>
-        <w:rPr>
-          <w:lang w:eastAsia="ko-KR"/>
-        </w:rPr>
-        <w:t>·</w:t>
-      </w:r>
-      <w:r>
-        <w:rPr>
-          <w:lang w:eastAsia="ko-KR"/>
-        </w:rPr>
-        <w:t>상품</w:t>
-      </w:r>
-      <w:r>
-        <w:rPr>
-          <w:lang w:eastAsia="ko-KR"/>
-        </w:rPr>
-        <w:t>·</w:t>
-      </w:r>
-      <w:r>
-        <w:rPr>
-          <w:lang w:eastAsia="ko-KR"/>
-        </w:rPr>
-        <w:t>기간</w:t>
-      </w:r>
-      <w:r>
-        <w:rPr>
-          <w:lang w:eastAsia="ko-KR"/>
-        </w:rPr>
-        <w:t xml:space="preserve">, </w:t>
-      </w:r>
-      <w:r>
-        <w:rPr>
-          <w:lang w:eastAsia="ko-KR"/>
-        </w:rPr>
-        <w:t>종류와</w:t>
-      </w:r>
-      <w:r>
-        <w:rPr>
-          <w:lang w:eastAsia="ko-KR"/>
-        </w:rPr>
-        <w:t xml:space="preserve"> </w:t>
-      </w:r>
-      <w:r>
-        <w:rPr>
-          <w:lang w:eastAsia="ko-KR"/>
-        </w:rPr>
-        <w:t>확인</w:t>
-      </w:r>
-      <w:r>
-        <w:rPr>
-          <w:lang w:eastAsia="ko-KR"/>
-        </w:rPr>
-        <w:t xml:space="preserve"> </w:t>
-      </w:r>
-      <w:r>
-        <w:rPr>
-          <w:lang w:eastAsia="ko-KR"/>
-        </w:rPr>
-        <w:t>여부</w:t>
-      </w:r>
-      <w:r>
-        <w:rPr>
-          <w:lang w:eastAsia="ko-KR"/>
-        </w:rPr>
-        <w:t xml:space="preserve">, </w:t>
-      </w:r>
-      <w:r>
-        <w:rPr>
-          <w:lang w:eastAsia="ko-KR"/>
-        </w:rPr>
-        <w:t>남은</w:t>
-      </w:r>
-      <w:r>
-        <w:rPr>
-          <w:lang w:eastAsia="ko-KR"/>
-        </w:rPr>
-        <w:t xml:space="preserve"> </w:t>
-      </w:r>
-      <w:r>
-        <w:rPr>
-          <w:lang w:eastAsia="ko-KR"/>
-        </w:rPr>
-        <w:t>요청</w:t>
-      </w:r>
-      <w:r>
-        <w:rPr>
-          <w:lang w:eastAsia="ko-KR"/>
-        </w:rPr>
-        <w:t xml:space="preserve"> </w:t>
-      </w:r>
-      <w:r>
-        <w:rPr>
-          <w:lang w:eastAsia="ko-KR"/>
-        </w:rPr>
-        <w:t>예산을</w:t>
-      </w:r>
-      <w:r>
-        <w:rPr>
-          <w:lang w:eastAsia="ko-KR"/>
-        </w:rPr>
-        <w:t xml:space="preserve"> </w:t>
-      </w:r>
-      <w:r>
-        <w:rPr>
-          <w:lang w:eastAsia="ko-KR"/>
-        </w:rPr>
-        <w:t>저장한</w:t>
-      </w:r>
-      <w:r>
-        <w:rPr>
-          <w:lang w:eastAsia="ko-KR"/>
-        </w:rPr>
-        <w:t xml:space="preserve"> </w:t>
-      </w:r>
-      <w:r>
-        <w:rPr>
-          <w:lang w:eastAsia="ko-KR"/>
-        </w:rPr>
-        <w:t>기록이다</w:t>
-      </w:r>
-      <w:r>
-        <w:rPr>
-          <w:lang w:eastAsia="ko-KR"/>
-        </w:rPr>
-        <w:t xml:space="preserve">. </w:t>
-      </w:r>
-      <w:proofErr w:type="spellStart"/>
-      <w:r>
-        <w:rPr>
-          <w:lang w:eastAsia="ko-KR"/>
-        </w:rPr>
-        <w:t>모수별</w:t>
-      </w:r>
-      <w:proofErr w:type="spellEnd"/>
-      <w:r>
-        <w:rPr>
-          <w:lang w:eastAsia="ko-KR"/>
-        </w:rPr>
-        <w:t xml:space="preserve"> </w:t>
-      </w:r>
-      <w:r>
-        <w:rPr>
-          <w:lang w:eastAsia="ko-KR"/>
-        </w:rPr>
-        <w:t>입력</w:t>
-      </w:r>
-      <w:r>
-        <w:rPr>
-          <w:lang w:eastAsia="ko-KR"/>
-        </w:rPr>
-        <w:t xml:space="preserve"> </w:t>
-      </w:r>
-      <w:r>
-        <w:rPr>
-          <w:lang w:eastAsia="ko-KR"/>
-        </w:rPr>
-        <w:t>항목을</w:t>
-      </w:r>
-      <w:r>
-        <w:rPr>
-          <w:lang w:eastAsia="ko-KR"/>
-        </w:rPr>
-        <w:t xml:space="preserve"> slot</w:t>
-      </w:r>
-      <w:r>
-        <w:rPr>
-          <w:lang w:eastAsia="ko-KR"/>
-        </w:rPr>
-        <w:t>이라</w:t>
-      </w:r>
-      <w:r>
-        <w:rPr>
-          <w:lang w:eastAsia="ko-KR"/>
-        </w:rPr>
-        <w:t xml:space="preserve"> </w:t>
-      </w:r>
-      <w:r>
-        <w:rPr>
-          <w:lang w:eastAsia="ko-KR"/>
-        </w:rPr>
-        <w:t>부른다</w:t>
-      </w:r>
-      <w:r>
-        <w:rPr>
-          <w:lang w:eastAsia="ko-KR"/>
-        </w:rPr>
-        <w:t xml:space="preserve">. </w:t>
-      </w:r>
-      <w:proofErr w:type="spellStart"/>
-      <w:r>
-        <w:rPr>
-          <w:lang w:eastAsia="ko-KR"/>
-        </w:rPr>
-        <w:t>모수</w:t>
-      </w:r>
-      <w:proofErr w:type="spellEnd"/>
-      <w:r>
-        <w:rPr>
-          <w:lang w:eastAsia="ko-KR"/>
-        </w:rPr>
-        <w:t xml:space="preserve"> </w:t>
-      </w:r>
-      <w:r>
-        <w:rPr>
-          <w:lang w:eastAsia="ko-KR"/>
-        </w:rPr>
-        <w:t>구성</w:t>
-      </w:r>
-      <w:r>
-        <w:rPr>
-          <w:lang w:eastAsia="ko-KR"/>
-        </w:rPr>
-        <w:t xml:space="preserve"> head(construction heads)</w:t>
-      </w:r>
-      <w:r>
-        <w:rPr>
-          <w:lang w:eastAsia="ko-KR"/>
-        </w:rPr>
-        <w:t>는</w:t>
-      </w:r>
-      <w:r>
-        <w:rPr>
-          <w:lang w:eastAsia="ko-KR"/>
-        </w:rPr>
-        <w:t xml:space="preserve"> </w:t>
-      </w:r>
-      <w:r>
-        <w:rPr>
-          <w:lang w:eastAsia="ko-KR"/>
-        </w:rPr>
-        <w:t>문서와</w:t>
-      </w:r>
-      <w:r>
-        <w:rPr>
-          <w:lang w:eastAsia="ko-KR"/>
-        </w:rPr>
-        <w:t xml:space="preserve"> slot</w:t>
-      </w:r>
-      <w:r>
-        <w:rPr>
-          <w:lang w:eastAsia="ko-KR"/>
-        </w:rPr>
-        <w:t>의</w:t>
-      </w:r>
-      <w:r>
-        <w:rPr>
-          <w:lang w:eastAsia="ko-KR"/>
-        </w:rPr>
-        <w:t xml:space="preserve"> </w:t>
-      </w:r>
-      <w:r>
-        <w:rPr>
-          <w:lang w:eastAsia="ko-KR"/>
-        </w:rPr>
-        <w:t>숫자</w:t>
-      </w:r>
-      <w:r>
-        <w:rPr>
-          <w:lang w:eastAsia="ko-KR"/>
-        </w:rPr>
-        <w:t xml:space="preserve"> </w:t>
-      </w:r>
-      <w:r>
-        <w:rPr>
-          <w:lang w:eastAsia="ko-KR"/>
-        </w:rPr>
-        <w:t>표현을</w:t>
-      </w:r>
-      <w:r>
-        <w:rPr>
-          <w:lang w:eastAsia="ko-KR"/>
-        </w:rPr>
-        <w:t xml:space="preserve"> </w:t>
-      </w:r>
-      <w:r>
-        <w:rPr>
-          <w:lang w:eastAsia="ko-KR"/>
-        </w:rPr>
-        <w:t>받아</w:t>
-      </w:r>
-      <w:r>
-        <w:rPr>
-          <w:lang w:eastAsia="ko-KR"/>
-        </w:rPr>
-        <w:t xml:space="preserve"> </w:t>
-      </w:r>
-      <w:r>
-        <w:rPr>
-          <w:lang w:eastAsia="ko-KR"/>
-        </w:rPr>
-        <w:t>후보를</w:t>
-      </w:r>
-      <w:r>
-        <w:rPr>
-          <w:lang w:eastAsia="ko-KR"/>
-        </w:rPr>
-        <w:t xml:space="preserve"> </w:t>
-      </w:r>
-      <w:r>
-        <w:rPr>
-          <w:lang w:eastAsia="ko-KR"/>
-        </w:rPr>
-        <w:t>예측한다</w:t>
-      </w:r>
-      <w:r>
-        <w:rPr>
-          <w:lang w:eastAsia="ko-KR"/>
-        </w:rPr>
-        <w:t>. Evidence head</w:t>
-      </w:r>
-      <w:r>
-        <w:rPr>
-          <w:lang w:eastAsia="ko-KR"/>
-        </w:rPr>
-        <w:t>는</w:t>
-      </w:r>
-      <w:r>
-        <w:rPr>
-          <w:lang w:eastAsia="ko-KR"/>
-        </w:rPr>
-        <w:t xml:space="preserve"> slot</w:t>
-      </w:r>
-      <w:r>
-        <w:rPr>
-          <w:lang w:eastAsia="ko-KR"/>
-        </w:rPr>
-        <w:t>의</w:t>
-      </w:r>
-      <w:r>
-        <w:rPr>
-          <w:lang w:eastAsia="ko-KR"/>
-        </w:rPr>
-        <w:t xml:space="preserve"> </w:t>
-      </w:r>
-      <w:r>
-        <w:rPr>
-          <w:lang w:eastAsia="ko-KR"/>
-        </w:rPr>
-        <w:t>문서</w:t>
-      </w:r>
-      <w:r>
-        <w:rPr>
-          <w:lang w:eastAsia="ko-KR"/>
-        </w:rPr>
-        <w:t xml:space="preserve"> </w:t>
-      </w:r>
-      <w:r>
-        <w:rPr>
-          <w:lang w:eastAsia="ko-KR"/>
-        </w:rPr>
-        <w:t>근거를</w:t>
-      </w:r>
-      <w:r>
-        <w:rPr>
-          <w:lang w:eastAsia="ko-KR"/>
-        </w:rPr>
-        <w:t>, type head</w:t>
-      </w:r>
-      <w:r>
-        <w:rPr>
-          <w:lang w:eastAsia="ko-KR"/>
-        </w:rPr>
-        <w:t>는</w:t>
-      </w:r>
-      <w:r>
-        <w:rPr>
-          <w:lang w:eastAsia="ko-KR"/>
-        </w:rPr>
-        <w:t xml:space="preserve"> </w:t>
-      </w:r>
-      <w:r>
-        <w:rPr>
-          <w:lang w:eastAsia="ko-KR"/>
-        </w:rPr>
-        <w:t>사실</w:t>
-      </w:r>
-      <w:r>
-        <w:rPr>
-          <w:lang w:eastAsia="ko-KR"/>
-        </w:rPr>
-        <w:t>·</w:t>
-      </w:r>
-      <w:r>
-        <w:rPr>
-          <w:lang w:eastAsia="ko-KR"/>
-        </w:rPr>
-        <w:t>추정</w:t>
-      </w:r>
-      <w:r>
-        <w:rPr>
-          <w:lang w:eastAsia="ko-KR"/>
-        </w:rPr>
-        <w:t>·</w:t>
-      </w:r>
-      <w:r>
-        <w:rPr>
-          <w:lang w:eastAsia="ko-KR"/>
-        </w:rPr>
-        <w:t>선호</w:t>
-      </w:r>
-      <w:r>
-        <w:rPr>
-          <w:lang w:eastAsia="ko-KR"/>
-        </w:rPr>
-        <w:t>·</w:t>
-      </w:r>
-      <w:r>
-        <w:rPr>
-          <w:lang w:eastAsia="ko-KR"/>
-        </w:rPr>
-        <w:t>가정의</w:t>
-      </w:r>
-      <w:r>
-        <w:rPr>
-          <w:lang w:eastAsia="ko-KR"/>
-        </w:rPr>
-        <w:t xml:space="preserve"> </w:t>
-      </w:r>
-      <w:r>
-        <w:rPr>
-          <w:lang w:eastAsia="ko-KR"/>
-        </w:rPr>
-        <w:t>종류를</w:t>
-      </w:r>
-      <w:r>
-        <w:rPr>
-          <w:lang w:eastAsia="ko-KR"/>
-        </w:rPr>
-        <w:t>, state head</w:t>
-      </w:r>
-      <w:r>
-        <w:rPr>
-          <w:lang w:eastAsia="ko-KR"/>
-        </w:rPr>
-        <w:t>는</w:t>
-      </w:r>
-      <w:r>
-        <w:rPr>
-          <w:lang w:eastAsia="ko-KR"/>
-        </w:rPr>
-        <w:t xml:space="preserve"> </w:t>
-      </w:r>
-      <w:r>
-        <w:rPr>
-          <w:lang w:eastAsia="ko-KR"/>
-        </w:rPr>
-        <w:t>미확인</w:t>
-      </w:r>
-      <w:r>
-        <w:rPr>
-          <w:lang w:eastAsia="ko-KR"/>
-        </w:rPr>
-        <w:t>·</w:t>
-      </w:r>
-      <w:r>
-        <w:rPr>
-          <w:lang w:eastAsia="ko-KR"/>
-        </w:rPr>
-        <w:t>후보</w:t>
-      </w:r>
-      <w:r>
-        <w:rPr>
-          <w:lang w:eastAsia="ko-KR"/>
-        </w:rPr>
-        <w:t>·</w:t>
-      </w:r>
-      <w:r>
-        <w:rPr>
-          <w:lang w:eastAsia="ko-KR"/>
-        </w:rPr>
-        <w:t>충돌</w:t>
-      </w:r>
-      <w:r>
-        <w:rPr>
-          <w:lang w:eastAsia="ko-KR"/>
-        </w:rPr>
-        <w:t xml:space="preserve"> </w:t>
-      </w:r>
-      <w:r>
-        <w:rPr>
-          <w:lang w:eastAsia="ko-KR"/>
-        </w:rPr>
-        <w:t>등의</w:t>
-      </w:r>
-      <w:r>
-        <w:rPr>
-          <w:lang w:eastAsia="ko-KR"/>
-        </w:rPr>
-        <w:t xml:space="preserve"> </w:t>
-      </w:r>
-      <w:r>
-        <w:rPr>
-          <w:lang w:eastAsia="ko-KR"/>
-        </w:rPr>
-        <w:t>상태를</w:t>
-      </w:r>
-      <w:r>
-        <w:rPr>
-          <w:lang w:eastAsia="ko-KR"/>
-        </w:rPr>
-        <w:t xml:space="preserve"> </w:t>
-      </w:r>
-      <w:r>
-        <w:rPr>
-          <w:lang w:eastAsia="ko-KR"/>
-        </w:rPr>
-        <w:t>예측한다</w:t>
-      </w:r>
-      <w:r>
-        <w:rPr>
-          <w:lang w:eastAsia="ko-KR"/>
-        </w:rPr>
-        <w:t>. Relation head</w:t>
-      </w:r>
-      <w:r>
-        <w:rPr>
-          <w:lang w:eastAsia="ko-KR"/>
-        </w:rPr>
-        <w:t>는</w:t>
-      </w:r>
-      <w:r>
-        <w:rPr>
-          <w:lang w:eastAsia="ko-KR"/>
-        </w:rPr>
-        <w:t xml:space="preserve"> </w:t>
-      </w:r>
-      <w:r>
-        <w:rPr>
-          <w:lang w:eastAsia="ko-KR"/>
-        </w:rPr>
-        <w:t>추출한</w:t>
-      </w:r>
-      <w:r>
-        <w:rPr>
-          <w:lang w:eastAsia="ko-KR"/>
-        </w:rPr>
-        <w:t xml:space="preserve"> </w:t>
-      </w:r>
-      <w:r>
-        <w:rPr>
-          <w:lang w:eastAsia="ko-KR"/>
-        </w:rPr>
-        <w:t>값과</w:t>
-      </w:r>
-      <w:r>
-        <w:rPr>
-          <w:lang w:eastAsia="ko-KR"/>
-        </w:rPr>
-        <w:t xml:space="preserve"> </w:t>
-      </w:r>
-      <w:r>
-        <w:rPr>
-          <w:lang w:eastAsia="ko-KR"/>
-        </w:rPr>
-        <w:t>허용</w:t>
-      </w:r>
-      <w:r>
-        <w:rPr>
-          <w:lang w:eastAsia="ko-KR"/>
-        </w:rPr>
-        <w:t xml:space="preserve"> </w:t>
-      </w:r>
-      <w:r>
-        <w:rPr>
-          <w:lang w:eastAsia="ko-KR"/>
-        </w:rPr>
-        <w:t>연산으로</w:t>
-      </w:r>
-      <w:r>
-        <w:rPr>
-          <w:lang w:eastAsia="ko-KR"/>
-        </w:rPr>
-        <w:t xml:space="preserve"> </w:t>
-      </w:r>
-      <w:r>
-        <w:rPr>
-          <w:lang w:eastAsia="ko-KR"/>
-        </w:rPr>
-        <w:t>만든</w:t>
-      </w:r>
-      <w:r>
-        <w:rPr>
-          <w:lang w:eastAsia="ko-KR"/>
-        </w:rPr>
-        <w:t xml:space="preserve"> </w:t>
-      </w:r>
-      <w:r>
-        <w:rPr>
-          <w:lang w:eastAsia="ko-KR"/>
-        </w:rPr>
-        <w:t>식들</w:t>
-      </w:r>
-      <w:r>
-        <w:rPr>
-          <w:lang w:eastAsia="ko-KR"/>
-        </w:rPr>
-        <w:t xml:space="preserve"> </w:t>
-      </w:r>
-      <w:r>
-        <w:rPr>
-          <w:lang w:eastAsia="ko-KR"/>
-        </w:rPr>
-        <w:t>가운데</w:t>
-      </w:r>
-      <w:r>
-        <w:rPr>
-          <w:lang w:eastAsia="ko-KR"/>
-        </w:rPr>
-        <w:t xml:space="preserve"> </w:t>
-      </w:r>
-      <w:r>
-        <w:rPr>
-          <w:lang w:eastAsia="ko-KR"/>
-        </w:rPr>
-        <w:t>사용할</w:t>
-      </w:r>
-      <w:r>
-        <w:rPr>
-          <w:lang w:eastAsia="ko-KR"/>
-        </w:rPr>
-        <w:t xml:space="preserve"> </w:t>
-      </w:r>
-      <w:r>
-        <w:rPr>
-          <w:lang w:eastAsia="ko-KR"/>
-        </w:rPr>
-        <w:t>식을</w:t>
-      </w:r>
-      <w:r>
-        <w:rPr>
-          <w:lang w:eastAsia="ko-KR"/>
-        </w:rPr>
-        <w:t xml:space="preserve"> </w:t>
-      </w:r>
-      <w:r>
-        <w:rPr>
-          <w:lang w:eastAsia="ko-KR"/>
-        </w:rPr>
-        <w:t>예측한다</w:t>
-      </w:r>
-      <w:r>
-        <w:rPr>
-          <w:lang w:eastAsia="ko-KR"/>
-        </w:rPr>
-        <w:t>.</w:t>
+      <w:r>
+        <w:rPr>
+          <w:lang w:eastAsia="ko-KR"/>
+        </w:rPr>
+        <w:t xml:space="preserve">모수 상태(parameter state, B)는 모수별 값·허용 범위·분포, 근거 위치, 단위·상품·기간, 종류와 확인 여부, 남은 요청 예산을 저장한 기록이다. 모수별 입력 항목을 slot이라 부른다. Evidence head는 slot의 값과 적용 조건을 지지하는 token span·표 cell·도구 결과를 선택한다. Type head는 사실·추정·선호·가정을 구분하고 state head는 확인 상태와 충돌을 예측한다. Relation head는 연산과 순서 있는 피연산자를 선택한다. 공유 도구 인자 모듈은 스키마의 필드 설명을 조건으로 관측 값을 추출하고 누락·충돌 필드를 반환한다.</w:t>
       </w:r>
     </w:p>
     <w:p>
@@ -15616,7 +14048,7 @@
         <w:rPr>
           <w:lang w:eastAsia="ko-KR"/>
         </w:rPr>
-        <w:t xml:space="preserve">구현 비교는 구조화 판단과 학습형 출력층을 같은 원문에 적용하는 방식으로 설계한다. 이번 고정 typed 비교군은 Qwen 7B의 조회 계획과 구조화 추출을 연결하고, agent는 같은 조회 도구를 관측 결과에 따라 사용한다. 제안 방식은 고정 encoder 위에서 근거·상태·계산 관계·행동을 업무 주석으로 학습한다. OpenJev-RLCD [16]와 PET [17]는 판단 분포를 읽는 방법의 참고 구현·선행 연구로 둔다. 고정 typed 구성에 학습형 정책을 연결하는 조건은 구성의 기여를 분리하는 재학습 비교로 설계한다.</w:t>
+        <w:t xml:space="preserve">구현 비교는 구조화 판단과 학습형 출력층을 같은 원문에 적용하는 방식으로 설계한다. 고정 typed 비교군은 Qwen 7B의 조회 계획과 구조화 추출을 연결하고, agent는 같은 조회 도구를 관측 결과에 따라 사용한다. 제안 방식은 ModernBERT [35]의 encoder와 근거·유형·상태·관계·행동 가치 head를 함께 학습하고, 시계열 encoder 및 내부 도구 인자 추출을 연결한다. OpenJev-RLCD [16]와 PET [17]는 판단 분포를 읽는 방법의 참고 구현·선행 연구로 둔다. 동일 head를 사용하는 base·large 크기 비교와 value 학습 제거 조건으로 각 요소의 기여를 확인한다.</w:t>
       </w:r>
     </w:p>
     <w:p>
@@ -19492,7 +17924,7 @@
         <w:rPr>
           <w:lang w:eastAsia="ko-KR"/>
         </w:rPr>
-        <w:t xml:space="preserve">이 절은 2.2절의 개념을 모수 구성과 요청 정책의 계산 절차로 구체화한다. 그림 2의 위쪽은 문서에서 검증 가능한 모수 상태를 만드는 과정이고, 아래쪽은 발주 민감도와 요청 비용으로 다음 행동을 선택하는 과정이다. 통제 Newsvendor 구현에서는 구성·value·recovery head를 연결한다. 공개 과제에서는 원래 주석에 맞춘 9개 head로 근거·상태·행동·계산·관측 판매를 학습했으며, 구현 결과와 비교 실행은 7절에서 제시한다.</w:t>
+        <w:t xml:space="preserve">이 절은 2.2절의 개념을 모수 구성과 요청 정책의 계산 절차로 구체화한다. 그림 2의 위쪽은 검증 가능한 모수 상태를 만드는 과정이고, 아래쪽은 발주 민감도와 요청 비용으로 다음 행동을 선택하는 과정이다. 통제 구현은 construction·value·recovery head를 연결하며, 현재 native-v3는 원래 주석에 맞춘 언어 head 8개와 수요 분포 head 4개를 학습했다. 다음 모델은 이를 공유 연구 head로 연결하고 내부 인자 추출과 시계열 표현을 학습한다. 완료한 결과와 다음 실행 계획은 7절에서 구분한다.</w:t>
       </w:r>
     </w:p>
     <w:p>
@@ -19560,55 +17992,7 @@
         <w:rPr>
           <w:lang w:eastAsia="ko-KR"/>
         </w:rPr>
-        <w:t>그림</w:t>
-      </w:r>
-      <w:r>
-        <w:rPr>
-          <w:lang w:eastAsia="ko-KR"/>
-        </w:rPr>
-        <w:t xml:space="preserve"> 2 </w:t>
-      </w:r>
-      <w:r>
-        <w:rPr>
-          <w:lang w:eastAsia="ko-KR"/>
-        </w:rPr>
-        <w:t>학습형</w:t>
-      </w:r>
-      <w:r>
-        <w:rPr>
-          <w:lang w:eastAsia="ko-KR"/>
-        </w:rPr>
-        <w:t xml:space="preserve"> Router</w:t>
-      </w:r>
-      <w:r>
-        <w:rPr>
-          <w:lang w:eastAsia="ko-KR"/>
-        </w:rPr>
-        <w:t>의</w:t>
-      </w:r>
-      <w:r>
-        <w:rPr>
-          <w:lang w:eastAsia="ko-KR"/>
-        </w:rPr>
-        <w:t xml:space="preserve"> </w:t>
-      </w:r>
-      <w:r>
-        <w:rPr>
-          <w:lang w:eastAsia="ko-KR"/>
-        </w:rPr>
-        <w:t>내부</w:t>
-      </w:r>
-      <w:r>
-        <w:rPr>
-          <w:lang w:eastAsia="ko-KR"/>
-        </w:rPr>
-        <w:t xml:space="preserve"> </w:t>
-      </w:r>
-      <w:r>
-        <w:rPr>
-          <w:lang w:eastAsia="ko-KR"/>
-        </w:rPr>
-        <w:t>구조</w:t>
+        <w:t xml:space="preserve">그림 2 기존 고정 encoder 구현의 구성·요청 흐름</w:t>
       </w:r>
     </w:p>
     <w:p>
@@ -19622,7 +18006,7 @@
         <w:rPr>
           <w:lang w:eastAsia="ko-KR"/>
         </w:rPr>
-        <w:t xml:space="preserve">문서는 입력, 신경망은 고정 encoder, 병렬 가지는 construction heads, 체크리스트는 validator, 산술식은 calculator, 표는 모수 상태 B, 막대는 value head의 예측, 마름모는 action selector를 나타낸다. Action features는 B와 행동을 숫자로 표현한 입력이다. 그림은 연구 모형의 전체 구조이며, 공개 과제의 head는 각 과제의 근거·상태·도구·계산 주석에 맞춰 연결한다.</w:t>
+        <w:t xml:space="preserve">그림은 기존 고정 encoder에서 construction heads·validator·calculator·모수 상태 B·value head·action selector를 연결한 흐름이다. 문서는 입력, 병렬 가지는 구성 판단, 막대는 행동 가치, Action features는 B와 행동의 표현이다. 다음 모델은 이 구성·갱신·요청 순환을 유지하면서 encoder를 학습 가능하게 하고, token pointer·시계열 encoder·분포 head·공유 도구 인자 모듈을 연결한다.</w:t>
       </w:r>
     </w:p>
     <w:p>
@@ -20548,6 +18932,76 @@
     <w:p>
       <w:pPr>
         <w:pStyle w:val="BodyText"/>
+        <w:rPr>
+          <w:lang w:eastAsia="ko-KR"/>
+        </w:rPr>
+      </w:pPr>
+      <w:r>
+        <w:rPr>
+          <w:lang w:eastAsia="ko-KR"/>
+        </w:rPr>
+        <w:t xml:space="preserve">권장 자연어 backbone은 ModernBERT-base [35]이다. 양방향 encoder 22층·hidden 768·149M 파라미터와 최대 8,192 token을 사용하며, token 표현을 유지하고 encoder와 head를 함께 미세조정한다. 긴 계약·정책은 겹치는 chunk로 나누어 질문·현재 상태를 조건으로 재순위화하고, 필요한 근거가 없으면 추가 조회한다. 문자 offset·표 cell·도구 결과의 ID를 보존한다. 같은 head를 붙인 ModernBERT-large는 28층·hidden 1,024·395M의 크기 비교군이다.</w:t>
+      </w:r>
+    </w:p>
+    <w:p>
+      <w:pPr>
+        <w:pStyle w:val="BodyText"/>
+        <w:rPr>
+          <w:lang w:eastAsia="ko-KR"/>
+        </w:rPr>
+      </w:pPr>
+      <w:r>
+        <w:rPr>
+          <w:lang w:eastAsia="ko-KR"/>
+        </w:rPr>
+        <w:t xml:space="preserve">모수·상태 결합은 256차원 2층 attention 모듈, 시계열 경로는 2층 GRU·hidden 128을 출발점으로 한다. 일반 head는 대체로 256→128→출력 차원이며, 근거·인자는 token/cell/entity pointer를 사용한다. 자연어 경로에는 문서·대화·표·도구 schema와 관측 결과를 넣고, 시계열에는 판매·품절·시간별 판매/재고 상태·할인·달력 이력을 넣는다. 미래 입력은 예측 시점에 알려진 달력·계획 정보로 제한한다.</w:t>
+      </w:r>
+    </w:p>
+    <w:p>
+      <w:pPr>
+        <w:pStyle w:val="BodyText"/>
+        <w:rPr>
+          <w:lang w:eastAsia="ko-KR"/>
+        </w:rPr>
+      </w:pPr>
+      <w:r>
+        <w:rPr>
+          <w:lang w:eastAsia="ko-KR"/>
+        </w:rPr>
+        <w:t xml:space="preserve">도구 인자 작성은 모델 내부의 공유 필드 모듈에 포함한다. 도구 schema의 필드 설명을 query로 사용해 span·관측 entity·enum·계산식·missing 중 값의 출처를 선택한다. 연산·단위 변환은 calculator가 실행하고 JSON은 serializer가 조립한다. 질문은 필드·이유·선택지를 출력해 템플릿으로 표현한다. 행동 후보의 tool ID와 인자를 함께 검증하며, 별도 자연어 생성 모델이 누락 인자나 질문·확인 여부를 대신 판단하지 않는다.</w:t>
+      </w:r>
+    </w:p>
+    <w:p>
+      <w:pPr>
+        <w:pStyle w:val="BodyText"/>
+        <w:rPr>
+          <w:lang w:eastAsia="ko-KR"/>
+        </w:rPr>
+      </w:pPr>
+      <w:r>
+        <w:rPr>
+          <w:lang w:eastAsia="ko-KR"/>
+        </w:rPr>
+        <w:t xml:space="preserve">수요는 다음 7일 총수요의 종류 head와 종류별 모수 head가 직접 출력한다. 절단정규·로그정규·Weibull마다 0수요 확률과 두 모수를 예측하고, horizon·예측 시작 offset·단위를 입력한다. Train 내부의 출처·시간 cross-fit에서 얻은 종류별 density/survival NLL로 조건부 예상 손실 점수 3개를 학습하고, 최저 점수의 종류·해당 모수를 선택한다. 이 familyScores는 참분포 종류의 사후확률이 아니다. 선택된 종류·모수에서 F를 구성하며 발주량은 공통 optimizer가 계산한다.</w:t>
+      </w:r>
+    </w:p>
+    <w:p>
+      <w:pPr>
+        <w:pStyle w:val="BodyText"/>
+        <w:rPr>
+          <w:lang w:eastAsia="ko-KR"/>
+        </w:rPr>
+      </w:pPr>
+      <w:r>
+        <w:rPr>
+          <w:lang w:eastAsia="ko-KR"/>
+        </w:rPr>
+        <w:t xml:space="preserve">같은 수요 head를 horizon=1로 재사용하여 비품절 density와 품절 survival의 일별 보조 likelihood를 학습한다. 1일 예측은 해당 1일 관측에, 7일 예측은 7일 합계에 채점한다. 일별 PDF/CDF를 합해 총수요 분포라고 취급하지 않는다. 문서와 판매 자료는 실제 SKU·기간이 연결될 때만 수요를 조건화하고, 현재 독립적인 공개 출처는 각 경로의 학습과 구조화 상태 결합에 사용한다.</w:t>
+      </w:r>
+    </w:p>
+    <w:p>
+      <w:pPr>
+        <w:pStyle w:val="BodyText"/>
         <w:spacing w:line="296" w:lineRule="atLeast"/>
         <w:rPr>
           <w:lang w:eastAsia="ko-KR"/>
@@ -21000,13 +19454,13 @@
         <w:rPr>
           <w:lang w:eastAsia="ko-KR"/>
         </w:rPr>
-        <w:t>고정</w:t>
-      </w:r>
-      <w:r>
-        <w:rPr>
-          <w:lang w:eastAsia="ko-KR"/>
-        </w:rPr>
-        <w:t xml:space="preserve"> encoder </w:t>
+        <w:t xml:space="preserve">학습 가능한 encoder</w:t>
+      </w:r>
+      <w:r>
+        <w:rPr>
+          <w:lang w:eastAsia="ko-KR"/>
+        </w:rPr>
+        <w:t xml:space="preserve"> </w:t>
       </w:r>
       <m:oMath>
         <m:sSub>
@@ -21041,117 +19495,117 @@
         <w:rPr>
           <w:lang w:eastAsia="ko-KR"/>
         </w:rPr>
-        <w:t>는</w:t>
-      </w:r>
-      <w:r>
-        <w:rPr>
-          <w:lang w:eastAsia="ko-KR"/>
-        </w:rPr>
-        <w:t xml:space="preserve"> chunk</w:t>
-      </w:r>
-      <w:r>
-        <w:rPr>
-          <w:lang w:eastAsia="ko-KR"/>
-        </w:rPr>
-        <w:t>와</w:t>
-      </w:r>
-      <w:r>
-        <w:rPr>
-          <w:lang w:eastAsia="ko-KR"/>
-        </w:rPr>
-        <w:t xml:space="preserve"> </w:t>
+        <w:t xml:space="preserve">는 chunk와 모수별 입력 항목인 slot의 설명을 함께 인코딩하여 token과 slot의 숫자 표현</w:t>
+      </w:r>
+      <w:r>
+        <w:rPr>
+          <w:lang w:eastAsia="ko-KR"/>
+        </w:rPr>
+        <w:t xml:space="preserve"/>
+      </w:r>
+      <w:r>
+        <w:rPr>
+          <w:lang w:eastAsia="ko-KR"/>
+        </w:rPr>
+        <w:t xml:space="preserve"/>
+      </w:r>
+      <w:r>
+        <w:rPr>
+          <w:lang w:eastAsia="ko-KR"/>
+        </w:rPr>
+        <w:t xml:space="preserve"/>
       </w:r>
       <w:proofErr w:type="spellStart"/>
       <w:r>
         <w:rPr>
           <w:lang w:eastAsia="ko-KR"/>
         </w:rPr>
-        <w:t>모수별</w:t>
+        <w:t xml:space="preserve"/>
       </w:r>
       <w:proofErr w:type="spellEnd"/>
       <w:r>
         <w:rPr>
           <w:lang w:eastAsia="ko-KR"/>
         </w:rPr>
-        <w:t xml:space="preserve"> </w:t>
-      </w:r>
-      <w:r>
-        <w:rPr>
-          <w:lang w:eastAsia="ko-KR"/>
-        </w:rPr>
-        <w:t>입력</w:t>
-      </w:r>
-      <w:r>
-        <w:rPr>
-          <w:lang w:eastAsia="ko-KR"/>
-        </w:rPr>
-        <w:t xml:space="preserve"> </w:t>
-      </w:r>
-      <w:r>
-        <w:rPr>
-          <w:lang w:eastAsia="ko-KR"/>
-        </w:rPr>
-        <w:t>항목인</w:t>
-      </w:r>
-      <w:r>
-        <w:rPr>
-          <w:lang w:eastAsia="ko-KR"/>
-        </w:rPr>
-        <w:t xml:space="preserve"> slot</w:t>
-      </w:r>
-      <w:r>
-        <w:rPr>
-          <w:lang w:eastAsia="ko-KR"/>
-        </w:rPr>
-        <w:t>의</w:t>
-      </w:r>
-      <w:r>
-        <w:rPr>
-          <w:lang w:eastAsia="ko-KR"/>
-        </w:rPr>
-        <w:t xml:space="preserve"> </w:t>
-      </w:r>
-      <w:r>
-        <w:rPr>
-          <w:lang w:eastAsia="ko-KR"/>
-        </w:rPr>
-        <w:t>설명을</w:t>
-      </w:r>
-      <w:r>
-        <w:rPr>
-          <w:lang w:eastAsia="ko-KR"/>
-        </w:rPr>
-        <w:t xml:space="preserve"> </w:t>
-      </w:r>
-      <w:r>
-        <w:rPr>
-          <w:lang w:eastAsia="ko-KR"/>
-        </w:rPr>
-        <w:t>각각</w:t>
-      </w:r>
-      <w:r>
-        <w:rPr>
-          <w:lang w:eastAsia="ko-KR"/>
-        </w:rPr>
-        <w:t xml:space="preserve"> </w:t>
-      </w:r>
-      <w:r>
-        <w:rPr>
-          <w:lang w:eastAsia="ko-KR"/>
-        </w:rPr>
-        <w:t>숫자</w:t>
-      </w:r>
-      <w:r>
-        <w:rPr>
-          <w:lang w:eastAsia="ko-KR"/>
-        </w:rPr>
-        <w:t xml:space="preserve"> </w:t>
-      </w:r>
-      <w:r>
-        <w:rPr>
-          <w:lang w:eastAsia="ko-KR"/>
-        </w:rPr>
-        <w:t>벡터</w:t>
+        <w:t xml:space="preserve"/>
+      </w:r>
+      <w:r>
+        <w:rPr>
+          <w:lang w:eastAsia="ko-KR"/>
+        </w:rPr>
+        <w:t xml:space="preserve"/>
+      </w:r>
+      <w:r>
+        <w:rPr>
+          <w:lang w:eastAsia="ko-KR"/>
+        </w:rPr>
+        <w:t xml:space="preserve"/>
+      </w:r>
+      <w:r>
+        <w:rPr>
+          <w:lang w:eastAsia="ko-KR"/>
+        </w:rPr>
+        <w:t xml:space="preserve"/>
+      </w:r>
+      <w:r>
+        <w:rPr>
+          <w:lang w:eastAsia="ko-KR"/>
+        </w:rPr>
+        <w:t xml:space="preserve"/>
+      </w:r>
+      <w:r>
+        <w:rPr>
+          <w:lang w:eastAsia="ko-KR"/>
+        </w:rPr>
+        <w:t xml:space="preserve"/>
+      </w:r>
+      <w:r>
+        <w:rPr>
+          <w:lang w:eastAsia="ko-KR"/>
+        </w:rPr>
+        <w:t xml:space="preserve"/>
+      </w:r>
+      <w:r>
+        <w:rPr>
+          <w:lang w:eastAsia="ko-KR"/>
+        </w:rPr>
+        <w:t xml:space="preserve"/>
+      </w:r>
+      <w:r>
+        <w:rPr>
+          <w:lang w:eastAsia="ko-KR"/>
+        </w:rPr>
+        <w:t xml:space="preserve"/>
+      </w:r>
+      <w:r>
+        <w:rPr>
+          <w:lang w:eastAsia="ko-KR"/>
+        </w:rPr>
+        <w:t xml:space="preserve"/>
+      </w:r>
+      <w:r>
+        <w:rPr>
+          <w:lang w:eastAsia="ko-KR"/>
+        </w:rPr>
+        <w:t xml:space="preserve"/>
+      </w:r>
+      <w:r>
+        <w:rPr>
+          <w:lang w:eastAsia="ko-KR"/>
+        </w:rPr>
+        <w:t xml:space="preserve"/>
+      </w:r>
+      <w:r>
+        <w:rPr>
+          <w:lang w:eastAsia="ko-KR"/>
+        </w:rPr>
+        <w:t xml:space="preserve"/>
+      </w:r>
+      <w:r>
+        <w:rPr>
+          <w:lang w:eastAsia="ko-KR"/>
+        </w:rPr>
+        <w:t xml:space="preserve"/>
       </w:r>
       <w:r>
         <w:rPr>
@@ -44545,7 +42999,7 @@
         <w:rPr>
           <w:lang w:eastAsia="ko-KR"/>
         </w:rPr>
-        <w:t xml:space="preserve">주 비교의 세 방법에는 같은 원문·항목 설명·관측 이력·초기 근거 조각·계산 후보와 조회 도구를 제공한다. 고정 typed 파이프라인은 조회 계획 뒤 구조화 답을 만들고, agent는 도구 결과를 읽고 다음 조회를 정한다. 학습형 router는 고정 encoder와 학습 head로 근거·상태·도구·계산을 선택한다. 같은 Qwen 언어 보조는 선택 뒤 인자·질문·발화를 표현하며 선택된 도구·상태·근거·계산 값은 유지한다. 고정 typed 구성에 학습형 정책을 연결하는 조건은 별도 재학습 실험으로 비교한다. 실제 호출·token·지연과 전체 처리 비용을 함께 기록한다.</w:t>
+        <w:t xml:space="preserve">주 비교의 세 방법에는 같은 원문·항목 설명·관측 이력·조회 자원·도구 schema와 비용 조건을 제공한다. 고정 typed 파이프라인은 조회 계획 뒤 구조화 답을 만들고, agent는 관측한 도구 결과로 다음 행동을 정한다. 제안 학습형은 ModernBERT token 표현과 공유 연구 head로 근거·유형·상태·계산·도구 인자·질문 대상을 직접 출력하며 Qwen helper를 호출하지 않는다. 고정 MiniLM과 Qwen 보조를 사용하는 현재 native-v3 비교는 기존 구현 진단으로 구분한다. base·large와 value 학습 제거 조건은 같은 head·입력·훈련 자료로 비교하고, 조회부터 최종 출력까지 전체 비용을 기록한다.</w:t>
       </w:r>
     </w:p>
     <w:p>
@@ -51923,7 +50377,7 @@
         <w:rPr>
           <w:lang w:eastAsia="ko-KR"/>
         </w:rPr>
-        <w:t xml:space="preserve">통제 환경의 요청 정책은 구성 head의 자기 예측 상태에서 학습한다. Train 묶음별 3-fold cross-fit으로 해당 묶음을 학습하지 않은 모델의 상태를 만들고, 요청·부분 답변·무응답 이후에도 같은 구성·검증·갱신을 실행한다. 학습용 planner는 각 구성의 자기 허용 집합에서 후속 손실을 계산한다. 참조 상태 </w:t>
+        <w:t xml:space="preserve">기존 통제 구현의 요청 정책은 구성 head의 자기 예측 상태에서 학습한다. Train 묶음별 3-fold cross-fit으로 해당 묶음을 학습하지 않은 모델의 상태를 만들고, 요청·부분 답변·무응답 이후에도 같은 구성·검증·갱신을 실행한다. 학습용 planner는 각 구성의 자기 허용 집합에서 후속 손실을 계산한다. 참조 상태 </w:t>
       </w:r>
       <m:oMath>
         <m:sSup>
@@ -52046,7 +50500,35 @@
         <w:rPr>
           <w:lang w:eastAsia="ko-KR"/>
         </w:rPr>
-        <w:t xml:space="preserve">를 통제 환경의 응답 모형과 현재 구성에 적용해 행동별 value·recovery 표적을 만든다. 공개 과제의 9개 head는 각 자료의 원래 Train·Dev 주석으로 학습한다.</w:t>
+        <w:t xml:space="preserve">를 통제 환경의 응답 모형과 현재 구성에 적용해 행동별 value·recovery 표적을 만든다. 현재 공개 과제의 언어 8개·수요 4개 head는 각 자료의 원래 Train·Dev 주석으로 학습한다.</w:t>
+      </w:r>
+    </w:p>
+    <w:p>
+      <w:pPr>
+        <w:pStyle w:val="BodyText"/>
+        <w:rPr>
+          <w:lang w:eastAsia="ko-KR"/>
+        </w:rPr>
+      </w:pPr>
+      <w:r>
+        <w:rPr>
+          <w:lang w:eastAsia="ko-KR"/>
+        </w:rPr>
+        <w:t xml:space="preserve">다음 모델은 원래 주석이 있는 출력에만 손실을 적용하는 masked multitask 학습을 사용한다. CUAD·ContractNLI는 근거·함의/모순, OR-ShARC는 규칙·추가 질문, ABCD는 도구·관측 인자, TAT-QA는 피연산자·연산·scale을 감독한다. 수요 NLL과 종류별 cross-fit 손실, 내부 인자 pointer 손실을 기존 구성 손실에 추가한다. 공개 주석에 없는 사실/선호·경제 가치 label을 다른 과제에서 이식하지 않는다.</w:t>
+      </w:r>
+    </w:p>
+    <w:p>
+      <w:pPr>
+        <w:pStyle w:val="BodyText"/>
+        <w:rPr>
+          <w:lang w:eastAsia="ko-KR"/>
+        </w:rPr>
+      </w:pPr>
+      <w:r>
+        <w:rPr>
+          <w:lang w:eastAsia="ko-KR"/>
+        </w:rPr>
+        <w:t xml:space="preserve">행동 가치·회복은 Train의 자기 예측 상태에서 요청을 실행하고 후속 응답·도구 결과를 관측한 rollout으로 학습한다. 수치 발주 환경의 가치 표적은 최종 발주 손실과 요청 비용·지연이며, 도구 workflow의 행동 표적과 구분한다. 아래 기존 통제 planner 회귀식은 과거 구현의 진단으로 유지하고, 새 모델의 행동 가치는 실제 rollout 표적을 사용한다. 참조 상태와 미래 응답은 provider 입력이나 행동 특성에 넣지 않는다.</w:t>
       </w:r>
     </w:p>
     <w:p>
@@ -52167,7 +50649,7 @@
         <w:rPr>
           <w:lang w:eastAsia="ko-KR"/>
         </w:rPr>
-        <w:t xml:space="preserve">통제 학습 planner는 현재 router가 만든 후보만 채점하고, 응답 뒤에도 같은 구성·갱신을 적용한다. 전달 표적 </w:t>
+        <w:t xml:space="preserve">기존 통제 학습 planner는 현재 router가 만든 후보만 채점하고, 응답 뒤에도 같은 구성·갱신을 적용한다. 전달 표적 </w:t>
       </w:r>
       <m:oMath>
         <m:sSup>
@@ -67011,7 +65493,7 @@
                 <w:sz w:val="18"/>
                 <w:lang w:eastAsia="ko-KR"/>
               </w:rPr>
-              <w:t xml:space="preserve">판매·품절 관측 조건과 판매 예측</w:t>
+              <w:t xml:space="preserve">다음 7일 총수요 분포의 종류·모수·F와 발주량</w:t>
             </w:r>
           </w:p>
         </w:tc>
@@ -67033,7 +65515,7 @@
                 <w:sz w:val="18"/>
                 <w:lang w:eastAsia="ko-KR"/>
               </w:rPr>
-              <w:t xml:space="preserve">과거 60일 → 후속 7일, 비품절·품절 오차 분리</w:t>
+              <w:t xml:space="preserve">과거 60일 → 후속 7일, 비품절 density·품절 survival 및 실제 출력 발주 손실</w:t>
             </w:r>
           </w:p>
         </w:tc>
@@ -67202,7 +65684,7 @@
         <w:rPr>
           <w:lang w:eastAsia="ko-KR"/>
         </w:rPr>
-        <w:t xml:space="preserve">FreshRetailNet은 과거 60일의 관측 판매·품절 정보를 입력으로 하고 후속 7일의 관측 판매를 예측한다. 비품절과 품절 구간의 오차를 각각 보고하며, 발주 구성에서는 판매 기록의 관측 조건을 확인한다. TAT-QA는 전체 문장·표 context와 원래 계산·scale 주석을 사용한다. 자료 revision·실제 수집 hash·라이선스와 가공 snapshot은 저장소에 고정했다.</w:t>
+        <w:t xml:space="preserve">FreshRetailNet은 과거 60일의 판매·품절 관측으로 다음 7일 총수요의 분포 종류·모수·F를 예측한다. 현재 모형은 연속 비음수 판매에 맞는 절단정규·로그정규·Weibull과 0수요 질량을 사용하며, 비품절 density와 품절 survival likelihood로 학습한다. 선택한 종류·모수로 구성한 F를 공통 optimizer에 전달하고 실제 출력 발주량을 채점한다. TAT-QA는 전체 문장·표 context와 원래 계산·scale 주석을 사용한다. 원천 revision·수집 hash·라이선스와 가공 snapshot은 저장소에 보존한다.</w:t>
       </w:r>
     </w:p>
     <w:p>
@@ -67272,7 +65754,7 @@
         <w:rPr>
           <w:lang w:eastAsia="ko-KR"/>
         </w:rPr>
-        <w:t xml:space="preserve">Encoder는 all-MiniLM-L6-v2 [34]를 고정하고 전체 텍스트를 256-token 조각으로 인코딩해 토큰 수로 가중 평균한 384차원 표현을 사용한다. 9개 head는 CUAD·NLI·OR-ShARC 상태, 근거 연결, ABCD 발화 여부·조건부 도구 선택, TAT-QA 계산 후보·scale, 7일 판매 예측이다. Train 원래 주석으로 학습하고 Dev로 checkpoint를 선택했으며, 5개 seed의 가중치·예측·원시 측정을 저장했다. CPU 결과는 다음과 같다.</w:t>
+        <w:t xml:space="preserve">현재 native-router-v3는 고정 all-MiniLM-L6-v2 [34]의 384차원 평균 표현을 사용하는 언어 head 8개와 수요 head 4개로 구성된다. 언어 head는 CUAD·NLI·OR-ShARC 상태와 근거, ABCD 발화·도구, TAT-QA 계산·scale을 학습한다. 수요 head는 각각 28→32→3이며 다음 7일 총수요의 종류와 종류별 모수를 출력한다. 학습 가능한 head 파라미터는 합계 209,824개이고 수요 부분은 4,108개이다. Train 원래 주석으로 학습하고 Dev로 checkpoint를 선택했으며, 5개 seed의 가중치·예측·원시 측정을 저장했다. 새 ModernBERT 모델의 결과가 아닌 현재 CPU 결과는 다음과 같다.</w:t>
       </w:r>
     </w:p>
     <w:tbl>
@@ -67729,7 +66211,7 @@
                 <w:sz w:val="18"/>
                 <w:lang w:eastAsia="ko-KR"/>
               </w:rPr>
-              <w:t xml:space="preserve">비품절 관측 판매 MAE (정규화 단위)</w:t>
+              <w:t xml:space="preserve">비품절 CRPS / 80% 구간 포함률 / 부족:잉여 3:1 발주 손실</w:t>
             </w:r>
           </w:p>
         </w:tc>
@@ -67751,7 +66233,7 @@
                 <w:sz w:val="18"/>
                 <w:lang w:eastAsia="ko-KR"/>
               </w:rPr>
-              <w:t xml:space="preserve">0.509</w:t>
+              <w:t xml:space="preserve">7.1025 / 21.4% / 17.4319</w:t>
             </w:r>
           </w:p>
         </w:tc>
@@ -67759,6 +66241,20 @@
     </w:tbl>
     <w:p>
       <w:pPr>
+        <w:pStyle w:val="BodyText"/>
+        <w:rPr>
+          <w:lang w:eastAsia="ko-KR"/>
+        </w:rPr>
+      </w:pPr>
+      <w:r>
+        <w:rPr>
+          <w:lang w:eastAsia="ko-KR"/>
+        </w:rPr>
+        <w:t xml:space="preserve">수요 rolling 평가는 Train 810·Dev 216·Test 324기간이며 원래 매장·상품 묶음 분할을 유지한다. 비품절 exact는 Train 105·Dev 24·Test 28기간이다. 5개 seed의 기간 평균 관측 NLL은 0.4093, CRPS는 7.1025, 부족:잉여 3:1 발주 손실은 17.4319, 80% 구간 포함률은 21.4%이다. Test에서는 모든 seed가 로그정규를 선택했다. 종류·모수·F의 형식 검증과 예측 calibration을 별도 측정한다.</w:t>
+      </w:r>
+    </w:p>
+    <w:p>
+      <w:pPr>
         <w:pStyle w:val="Heading2"/>
         <w:rPr>
           <w:lang w:eastAsia="ko-KR"/>
@@ -67796,7 +66292,7 @@
         <w:rPr>
           <w:lang w:eastAsia="ko-KR"/>
         </w:rPr>
-        <w:t xml:space="preserve">Qwen2.5-7B-Instruct [33]의 같은 revision과 출력 상한을 사용한다. 공개 구성 과제에서 typed는 고정 조회 계획 뒤 최대 2회 조회와 구조화 추출을 실행하고, agent는 최대 2회 조회를 관측 결과에 따라 정한다. 학습형은 같은 초기 근거 조각·계산 후보에서 head가 선택한 결과를 같은 Qwen으로 표현한다. 공통 문맥 상한은 32,768 token, 새 출력 상한은 512 token이다. 주문 대화에는 같은 고객 확인·변경 승인 검사와 도구·턴 예산을 적용한다.</w:t>
+        <w:t xml:space="preserve">현재 GPU runner는 pinned Qwen2.5-7B-Instruct [33]로 typed의 고정 조회 계획·구조화 추출과 agent의 적응 조회를 실행한다. 기존 학습형은 도구 선택 뒤 Qwen이 인자·질문·발화를 구성하고, 주문 대화에서는 누락 인자 질문과 확인 요청도 맡긴다. 이 실행은 기존 adapter와 보조 모듈의 진단이다. 다음 학습형은 자체 head가 인자와 질문 대상을 출력하고 템플릿·serializer가 표현하며, Qwen 보조를 호출하지 않는다. 모든 비교군에 같은 원문·조회 자원·도구·validator·optimizer와 명시적인 호출·턴 예산을 적용한다.</w:t>
       </w:r>
     </w:p>
     <w:p>
@@ -67810,7 +66306,7 @@
         <w:rPr>
           <w:lang w:eastAsia="ko-KR"/>
         </w:rPr>
-        <w:t xml:space="preserve">현재의 주요 병목은 계산 후보와 도구 인자 구성이다. TAT-QA Train 144건 중 정답 계산이 후보에 포함된 것은 50건으로, 후보 생성 실패와 후보 선택 오류를 분리해 분석한다. ABCD는 발화 여부와 조건부 도구 선택을 분리했으며 GPU 비교에서 선택 뒤 언어 보조의 인자 구성 효과를 측정한다. 이후 구성·정책 교차와 근거·상태·갱신의 재학습 제거 실험으로 각 요소의 기여를 확인한다.</w:t>
+        <w:t xml:space="preserve">현재 TAT-QA Train 144건 중 정답 계산이 고정 후보에 포함된 사례는 50건이고, ABCD 도구 선택 학습은 85개 사건이다. 다음 구현은 후보 48개 중 선택하는 방식에서 연산·피연산자 pointer로 전환하고, 확보한 ABCD 원천 Train 대화 8,034개를 포함해 훈련 자료를 확장한다. 기존 Test와 연결된 출처·template는 Train에서 제외한다. 내부 인자 추출은 필드별 관측 span·entity·선택지·계산식·missing을 선택하고, list·object는 스키마 구조에 따라 조립한다.</w:t>
       </w:r>
     </w:p>
     <w:p>
@@ -68377,7 +66873,7 @@
         <w:rPr>
           <w:lang w:eastAsia="ko-KR"/>
         </w:rPr>
-        <w:t xml:space="preserve">공개 과제는 상태·근거 결합, 규칙 결정, 도구·관측 인자, 답·scale 및 관측 판매 MAE를 각각 채점한다. 주문 대화는 최종 DB를 참고 행동의 실행 결과와 비교하고, 조회 과제의 목표 응답·필수 이관과 변경 승인 위반도 검사한다. 거래 원장 차이(모의 USD), 상호작용 수와 판정 coverage를 함께 기록한다. 참고 변경이 실패한 orders-105는 주석 모호성을 표시하여 유지한다. 발주 환경에서는 최종 regret과 요청 부담, 참모수의 </w:t>
+        <w:t xml:space="preserve">공개 과제는 상태·근거 결합, 규칙 결정, 도구·관측 인자, 답·scale 및 수요 분포 NLL·CRPS·구간 포함률과 실제 출력 발주 손실을 각각 채점한다. 주문 대화는 최종 DB를 참고 행동의 실행 결과와 비교하고, 조회 과제의 목표 응답·필수 이관과 변경 승인 위반도 검사한다. 거래 원장 차이(모의 USD), 상호작용 수와 판정 coverage를 함께 기록한다. 참고 변경이 실패한 orders-105는 주석 모호성을 표시하여 유지한다. 발주 환경에서는 최종 regret과 요청 부담, 참모수의 </w:t>
       </w:r>
       <m:oMath>
         <m:r>
@@ -68406,7 +66902,7 @@
         <w:rPr>
           <w:lang w:eastAsia="ko-KR"/>
         </w:rPr>
-        <w:t xml:space="preserve">정책 차이는 같은 사례에서 짝지어 비교한다. 공개 과제는 먼저 사례 안에서 5개 seed를 평균한 뒤 출처 묶음별 paired bootstrap으로 95% 신뢰구간을 구한다. 주문 대화는 고객 묶음별 성공·위반·턴·호출의 차이를 보고한다. 원시 답변·판정과 token 수, 추론 지연·최대 메모리·cache 여부를 보존한다. 전체 비용에는 encoder와 언어 보조를 포함한다. 질문 부담은 횟수와 시간으로 제시하고 발주 성과와 함께 비교한다.</w:t>
+        <w:t xml:space="preserve">정책 차이는 같은 사례에서 짝지어 비교한다. 공개 과제는 먼저 사례 안에서 5개 seed를 평균한 뒤 출처 묶음별 paired bootstrap으로 95% 신뢰구간을 구한다. 주문 대화는 고객 묶음별 성공·위반·턴·호출의 차이를 보고한다. 원시 답변·판정과 token 수, 추론 지연·최대 메모리·cache 여부를 보존한다. 기존 경로의 비용에는 encoder와 Qwen 보조를 모두 포함하고, 새 모델에는 자연어·시계열 encoder와 head·조회·계산 실행을 포함한다. 질문은 필요한 필드와 충돌 해소의 정확성 및 부담을 평가하며, 문장 참고 F1만으로 핵심 성과를 결정하지 않는다.</w:t>
       </w:r>
     </w:p>
     <w:p>
@@ -68448,7 +66944,7 @@
         <w:rPr>
           <w:lang w:eastAsia="ko-KR"/>
         </w:rPr>
-        <w:t xml:space="preserve">다음 실행은 두 단계이다. 먼저 공개 구성 과제에서 typed·agent와 5개 seed 학습형의 GPU 결과를 얻어 CPU 결과와 같은 원래 과제 지표로 짝지어 비교한다. 이어 주문 Test 25건에서 세 방법의 전체 대화를 실행한다. 이때 학습형은 seed 42의 ABCD head를 재학습 없이 전이한다. 결과를 바탕으로 TAT-QA 후보 생성과 ABCD 인자 구성의 병목을 개선하고, 구성·정책 교차 및 재학습 제거 실험을 진행한다. 발주 실험에서는 같은 근거 상태의 발주 영향·질문 비용·지연을 독립적으로 바꾸어 행동 가치 학습의 효과를 분리한다.</w:t>
+        <w:t xml:space="preserve">다음 구현은 세 단계로 진행한다. 먼저 기존 Test 출처 묶음을 보호하면서 공개 Train 자료를 확대하고, ModernBERT와 공유 근거·유형·상태·관계·도구 인자 head를 원래 주석으로 학습한다. 주석이 없는 출력은 손실을 mask한다. 이어 FreshRetail의 판매·품절 이력으로 시계열 encoder와 분포 head를 학습한다. 마지막으로 자기 예측 상태와 응답 후 갱신을 사용한 Train rollout에서 행동 가치·회복을 학습한다. 가치 표적은 실제 최종 발주 손실·요청 비용·지연으로 구성하며, 생성기의 정확한 planner 행동을 모방하는 실험만으로 종료하지 않는다.</w:t>
       </w:r>
     </w:p>
     <w:p>
@@ -68462,7 +66958,7 @@
         <w:rPr>
           <w:lang w:eastAsia="ko-KR"/>
         </w:rPr>
-        <w:t xml:space="preserve">GPU 실행은 저장된 가공 snapshot과 5개 seed 가중치에서 바로 시작한다. 명령은 아래와 같고, components·orders 단계를 따로 실행하거나 cache에서 이어갈 수 있다. 이후 완료 기준은 typed 대비 발주 손실 개선과 묶음별 신뢰구간, 근거 없는 발주·마감 위반, 자율 처리율·질문 시간·전체 추론 비용을 함께 충족하는 것이다. 개선 없이 확인 부담만 늘면 해당 도입 가설을 기각하거나 적용 범위를 조정한다.</w:t>
+        <w:t xml:space="preserve">새 모델의 주 후보는 ModernBERT-base와 동일 head의 ModernBERT-large이며, base에서 행동 가치 학습을 제거한 조건을 추가한다. 고정 typed·agent와 같은 원문·도구에서 인자·필수 질문·근거·상태·분포 calibration·실제 출력 발주 손실·상호작용 수·전체 지연과 메모리를 비교한다. base의 전체 파라미터 152–155M과 large 약 400M은 구현 전 설계 예산이다. 아래 명령은 저장된 snapshot과 기존 native-v3의 Qwen 보조 비교를 실행하며 새 ModernBERT의 구현·학습 명령은 아니다.</w:t>
       </w:r>
     </w:p>
     <w:p>
@@ -68479,6 +66975,20 @@
           <w:sz w:val="18"/>
         </w:rPr>
         <w:t xml:space="preserve">uv run --no-project scripts/run_gpu.py --stage all</w:t>
+      </w:r>
+    </w:p>
+    <w:p>
+      <w:pPr>
+        <w:pStyle w:val="BodyText"/>
+        <w:rPr>
+          <w:lang w:eastAsia="ko-KR"/>
+        </w:rPr>
+      </w:pPr>
+      <w:r>
+        <w:rPr>
+          <w:lang w:eastAsia="ko-KR"/>
+        </w:rPr>
+        <w:t xml:space="preserve">기존 GPU 비교의 원시 결과는 보존하되, 새 모델의 완료 기준은 같은 업무 목적에서 typed·agent 대비 발주 손실과 요청 부담을 줄이고 근거 없는 전달·마감·권한 위반을 증가시키지 않는 것이다. source 묶음별 paired 신뢰구간과 전체 추론 비용을 함께 보고하며, 동일 입력·head·훈련 자료의 base/large 비교로 필요한 용량을 결정한다.</w:t>
       </w:r>
     </w:p>
     <w:p>
@@ -69151,6 +67661,20 @@
       </w:pPr>
       <w:r>
         <w:t xml:space="preserve">[34] Sentence Transformers. all-MiniLM-L6-v2 [Model, revision 1110a243fdf4706b3f48f1d95db1a4f5529b4d41; Apache 2.0]. https://huggingface.co/sentence-transformers/all-MiniLM-L6-v2</w:t>
+      </w:r>
+    </w:p>
+    <w:p>
+      <w:pPr>
+        <w:pStyle w:val="BodyText"/>
+        <w:rPr>
+          <w:lang w:eastAsia="ko-KR"/>
+        </w:rPr>
+      </w:pPr>
+      <w:r>
+        <w:rPr>
+          <w:lang w:eastAsia="ko-KR"/>
+        </w:rPr>
+        <w:t xml:space="preserve">[35] Warner, B., Chaffin, A., Clavié, B., et al. (2024). Smarter, Better, Faster, Longer: A Modern Bidirectional Encoder for Fast, Memory Efficient, and Long Context Finetuning and Inference. arXiv:2412.13663. https://arxiv.org/abs/2412.13663 . 공식 모델: https://huggingface.co/answerdotai/ModernBERT-base ; https://huggingface.co/answerdotai/ModernBERT-large . 예정 revision과 Apache 2.0 출처는 docs/sources.md에 고정한다.</w:t>
       </w:r>
     </w:p>
     <w:p>
@@ -70118,7 +68642,7 @@
         <w:rPr>
           <w:lang w:eastAsia="ko-KR"/>
         </w:rPr>
-        <w:t xml:space="preserve">OpenAI 기반 AI 보조 도구를 문헌·공식 자료 검색, 문서 작성·수정, 구현과 실험 준비 및 수식·수치 점검에 사용하였다. 이번 수정에서는 최신 구현 commit의 워크로드와 비교 조건, 완료한 CPU 학습·평가, GPU 실행 계획을 반영하였다. 기본 Newsvendor 해와 부분 모수의 worst-case regret, 순차 요청 예제는 Python 계산과 기존 수치 검증으로 확인하였다. 실행한 학습의 모델 revision·설정·원시 결과는 저장소에 보존하였다.</w:t>
+        <w:t xml:space="preserve">OpenAI 기반 AI 보조 도구를 문헌·공식 자료 검색, 문서 작성·수정, 구현과 실험 준비 및 수식·수치 점검에 사용하였다. 이번 수정은 main 6d3acf3의 현재 분포 head·CPU 결과와 다음 ModernBERT·내부 도구 인자·시계열·행동 가치 학습 계획을 기존 문서에 반영했다. 새 모델 계획을 완료한 구현이나 실험으로 보고하지 않는다. 기본 Newsvendor 해와 순차 요청 예제는 기존 수치 검증을 유지하며, 원천 revision·설정·원시 결과를 저장소에 보존한다.</w:t>
       </w:r>
     </w:p>
     <w:p>
@@ -70133,7 +68657,7 @@
         <w:rPr>
           <w:lang w:eastAsia="ko-KR"/>
         </w:rPr>
-        <w:t xml:space="preserve">제출 전 팀원은 모형 가정·수식·인용과 실제 수행 역할을 확인하고, 남은 GPU 결과를 반영해 사용한 도구·버전·용도를 확정한다.</w:t>
+        <w:t xml:space="preserve">제출 전 팀원은 모형 가정·수식·인용과 실제 수행 역할을 확인하고, 새 모델 구현·GPU 학습·비교 결과를 반영해 사용한 도구·버전·용도를 갱신한다.</w:t>
       </w:r>
     </w:p>
     <w:sectPr>

</xml_diff>

<commit_message>
Compare fixed AI with a conventional baseline and prepare participant study
Implement observed-only rule extraction, censored statistical demand fitting,
and a shared questioning policy. Run the four AI-by-question conditions on
Train and existing Dev, preserve raw trajectories, and publish source-level
contrasts with isolated GPU and CPU reproductions.

Provide a Korean participant experiment with consent, concealed assignment,
practice and main tasks, actual frozen-model advice, resumable responses,
withdrawal, private export, and participant-level analysis. Include operating
and Word guides; real human observations remain zero.

Validation: 407 tests, Ruff, five source-group audits, 30 numerical smoke
scenarios, 160 isolated GPU paths, exact CPU reanalysis, full browser rehearsal,
and an isolated runtime-kit check. Do not interpret reused Dev or generated
laboratory tasks as organizational effectiveness.
</commit_message>
<xml_diff>
--- a/docs/proposal.docx
+++ b/docs/proposal.docx
@@ -28,7 +28,7 @@
         </w:p>
       </w:sdtContent>
     </w:sdt>
-    <w:bookmarkStart w:id="47" w:name="ai의-정보처리와-매니저-판단이-발주-의사결정에-미치는-영향"/>
+    <w:bookmarkStart w:id="53" w:name="ai의-정보처리와-매니저-판단이-발주-의사결정에-미치는-영향"/>
     <w:p>
       <w:pPr>
         <w:pStyle w:val="Heading1"/>
@@ -1687,7 +1687,7 @@
       </w:r>
     </w:p>
     <w:bookmarkEnd w:id="30"/>
-    <w:bookmarkStart w:id="33" w:name="효과의-식별과-회귀"/>
+    <w:bookmarkStart w:id="38" w:name="효과의-식별과-회귀"/>
     <w:p>
       <w:pPr>
         <w:pStyle w:val="Heading2"/>
@@ -1925,13 +1925,13 @@
       </w:r>
     </w:p>
     <w:bookmarkEnd w:id="31"/>
-    <w:bookmarkStart w:id="32" w:name="후속-실험-ai-사용-질문-허용"/>
+    <w:bookmarkStart w:id="33" w:name="실행한-파일럿-ai-사용-질문-허용"/>
     <w:p>
       <w:pPr>
         <w:pStyle w:val="Heading3"/>
       </w:pPr>
       <w:r>
-        <w:t xml:space="preserve">4.2 후속 실험: AI 사용 × 질문 허용</w:t>
+        <w:t xml:space="preserve">4.2 실행한 파일럿: AI 사용 × 질문 허용</w:t>
       </w:r>
     </w:p>
     <w:p>
@@ -1939,7 +1939,7 @@
         <w:pStyle w:val="FirstParagraph"/>
       </w:pPr>
       <w:r>
-        <w:t xml:space="preserve">비AI 기준선과 AI 경로를 정의한 뒤, 동일한 사례에 A∈{0,1}(AI 사용), H∈{0,1}(질문 허용)의 네 조건을 교차한다. optimizer·질문 규칙·비용·예산·응답 환경을 우선 공통으로 둔다. 실제 참여자에게 배정하는 실험이라면 처치·제시 순서의 무작위화와 참여자 내 반복을 별도로 설계한다.</w:t>
+        <w:t xml:space="preserve">관측 문서의 규칙 추출과 검열 로그정규 수요 추정을 사용하는 비AI 기준선을 구현했다. Train 154사례·13출처에서 검증한 뒤 같은 입력의 기존 Dev 336사례·8출처에서 A∈{0,1}(정의한 AI 묶음), H∈{0,1}(질문 허용)을 교차했다. 문서 조건 다섯 개를 포함한 6,720경로를 L40S에서 실행했다. optimizer·질문 규칙·비용·예산·응답 환경은 공통이다. 신경망 가중치는 고정했다.</w:t>
       </w:r>
     </w:p>
     <w:p>
@@ -2095,21 +2095,220 @@
             </m:rPr>
             <m:t>+</m:t>
           </m:r>
-          <m:sSup>
+          <m:sSub>
             <m:e>
               <m:r>
-                <m:t>γ</m:t>
+                <m:t>ε</m:t>
               </m:r>
             </m:e>
-            <m:sup>
+            <m:sub>
+              <m:r>
+                <m:t>i</m:t>
+              </m:r>
+              <m:r>
+                <m:t>j</m:t>
+              </m:r>
+            </m:sub>
+          </m:sSub>
+          <m:r>
+            <m:rPr>
+              <m:sty m:val="p"/>
+            </m:rPr>
+            <m:t>.</m:t>
+          </m:r>
+        </m:oMath>
+      </m:oMathPara>
+    </w:p>
+    <w:p>
+      <w:pPr>
+        <w:pStyle w:val="FirstParagraph"/>
+      </w:pPr>
+      <w:r>
+        <w:t xml:space="preserve">주 분석은 관리자 기준 b가 이미 선택된 사례다. b 미선택 사례는 별도 층이다. 원래 문서의 정확한 손실은 같은 25조건·고유 수요 기간 5개·출처 4개에서 계산된다. 평균 총손실은 A0H0 409.3229, A0H1 72.1592, A1H0 399.0899, A1H1 20.9941이다. βA=−10.2330, βH=−337.1636, βAH=−40.9321이며, 질문 허용 상태의 AI−비AI 차이는 −51.1651이다.</w:t>
+      </w:r>
+    </w:p>
+    <w:p>
+      <w:pPr>
+        <w:pStyle w:val="BodyText"/>
+      </w:pPr>
+      <w:r>
+        <w:t xml:space="preserve">이 차이는 정의한 비AI 기준선과 고정 AI 묶음의 비교다. 원래 문서에서는 두 방법의 모수·근거·질문이 같으므로 발주 손실 차이는 수요 추정 경로에서 나온다. 정형 생성 문서에서는 비AI 규칙이 더 정확한 조건도 있다. 상품·기간·버전 혼입에서 AI는 불필요 질문이 늘고, 질문을 금지하면 비AI보다 손실이 높다. 전체 표·출처 민감도·원시 기록은</w:t>
+      </w:r>
+      <w:r>
+        <w:t xml:space="preserve"> </w:t>
+      </w:r>
+      <w:hyperlink r:id="rId32">
+        <w:r>
+          <w:rPr>
+            <w:rStyle w:val="Hyperlink"/>
+          </w:rPr>
+          <w:t xml:space="preserve">ai-comparison.md</w:t>
+        </w:r>
+      </w:hyperlink>
+      <w:r>
+        <w:t xml:space="preserve">에 있다.</w:t>
+      </w:r>
+    </w:p>
+    <w:p>
+      <w:pPr>
+        <w:pStyle w:val="BodyText"/>
+      </w:pPr>
+      <w:r>
+        <w:t xml:space="preserve">H0의 원래 사례 80%는 누락 때문에 보류하므로 큰 질문 효과에는 보류 해소가 포함된다. 이를 사람과 AI의 일반적인 보완성으로 해석하지 않는다. 단일 비AI 수요 추정 방식이 모든 통계적 기준선을 대표하지 않으며, 이미 개발한 Dev와 적은 출처의 결과는 확증이 아니다. p값·신뢰구간은 보고하지 않았다. 처치 전 환경 X에 따른 이질성은 새로운 자료에서 A×X 등을 미리 정해 검증할 후속 대상이다.</w:t>
+      </w:r>
+    </w:p>
+    <w:bookmarkEnd w:id="33"/>
+    <w:bookmarkStart w:id="37" w:name="준비한-참여자-실험-사람의-ai-정보-지원-효과"/>
+    <w:p>
+      <w:pPr>
+        <w:pStyle w:val="Heading3"/>
+      </w:pPr>
+      <w:r>
+        <w:t xml:space="preserve">4.3 준비한 참여자 실험: 사람의 AI 정보 지원 효과</w:t>
+      </w:r>
+    </w:p>
+    <w:p>
+      <w:pPr>
+        <w:pStyle w:val="FirstParagraph"/>
+      </w:pPr>
+      <w:r>
+        <w:t xml:space="preserve">사람을 모집하면 바로 사용할 한국어 브라우저 실험을 구현했다. AI 없음과 AI 있음에 참여자 단위 1:1 배정하며 양쪽 모두 문서·판매 이력·계산 보조·매니저 질문을 사용한다. AI군에 고정 모델의 모수·근거·수요·발주량 제안이 추가된다. 최종 결정자는 참여자다. 매니저 응답은 프로그램이 제공한다. 사람의 AI 사용을 무작위 배정하는 접근은 Noy와 Zhang [5]의 연구와 관련되지만, 글쓰기의 효과를 발주 과제로 옮겨 가정하지 않는다.</w:t>
+      </w:r>
+    </w:p>
+    <w:p>
+      <w:pPr>
+        <w:pStyle w:val="BodyText"/>
+      </w:pPr>
+      <w:r>
+        <w:t xml:space="preserve">동의·이해 확인 뒤 네 명 단위로 두 명씩 배정하고, 연습 2개와 순서를 무작위화한 본 과제 8개를 제공한다. 공통 질문은 과제당 최대 2회·회당 4점, 보류는 400점, 발주량은 0~70이다. 주 결과는 본 과제별 기대 regret 또는 보류 비용과 질문 비용의 합을 400으로 나눈 참여자 평균이다. 완전한 배정 결과에서는 다음 블록 조정 회귀와 블록 내 무작위화 검정을 사용한다.</w:t>
+      </w:r>
+    </w:p>
+    <w:p>
+      <w:pPr>
+        <w:pStyle w:val="BodyText"/>
+      </w:pPr>
+      <m:oMathPara>
+        <m:oMathParaPr>
+          <m:jc m:val="center"/>
+        </m:oMathParaPr>
+        <m:oMath>
+          <m:sSub>
+            <m:e>
+              <m:acc>
+                <m:accPr>
+                  <m:chr m:val="‾"/>
+                </m:accPr>
+                <m:e>
+                  <m:r>
+                    <m:t>Y</m:t>
+                  </m:r>
+                </m:e>
+              </m:acc>
+            </m:e>
+            <m:sub>
+              <m:r>
+                <m:t>i</m:t>
+              </m:r>
+            </m:sub>
+          </m:sSub>
+          <m:r>
+            <m:rPr>
+              <m:sty m:val="p"/>
+            </m:rPr>
+            <m:t>=</m:t>
+          </m:r>
+          <m:r>
+            <m:t>α</m:t>
+          </m:r>
+          <m:r>
+            <m:rPr>
+              <m:sty m:val="p"/>
+            </m:rPr>
+            <m:t>+</m:t>
+          </m:r>
+          <m:r>
+            <m:t>τ</m:t>
+          </m:r>
+          <m:sSub>
+            <m:e>
               <m:r>
                 <m:rPr>
                   <m:sty m:val="p"/>
                 </m:rPr>
-                <m:t>⊤</m:t>
+                <m:t>AI</m:t>
+              </m:r>
+            </m:e>
+            <m:sub>
+              <m:r>
+                <m:t>i</m:t>
+              </m:r>
+            </m:sub>
+          </m:sSub>
+          <m:r>
+            <m:rPr>
+              <m:sty m:val="p"/>
+            </m:rPr>
+            <m:t>+</m:t>
+          </m:r>
+          <m:nary>
+            <m:naryPr>
+              <m:chr m:val="∑"/>
+              <m:limLoc m:val="undOvr"/>
+              <m:subHide m:val="off"/>
+              <m:supHide m:val="on"/>
+            </m:naryPr>
+            <m:sub>
+              <m:r>
+                <m:t>b</m:t>
+              </m:r>
+              <m:r>
+                <m:rPr>
+                  <m:sty m:val="p"/>
+                </m:rPr>
+                <m:t>≠</m:t>
+              </m:r>
+              <m:r>
+                <m:t>1</m:t>
+              </m:r>
+            </m:sub>
+            <m:sup>
+              <m:r>
+                <m:t>​</m:t>
               </m:r>
             </m:sup>
-          </m:sSup>
+            <m:e>
+              <m:sSub>
+                <m:e>
+                  <m:r>
+                    <m:t>η</m:t>
+                  </m:r>
+                </m:e>
+                <m:sub>
+                  <m:r>
+                    <m:t>b</m:t>
+                  </m:r>
+                </m:sub>
+              </m:sSub>
+            </m:e>
+          </m:nary>
+          <m:r>
+            <m:rPr>
+              <m:sty m:val="b"/>
+            </m:rPr>
+            <m:t>1</m:t>
+          </m:r>
+          <m:r>
+            <m:rPr>
+              <m:sty m:val="p"/>
+            </m:rPr>
+            <m:t>{</m:t>
+          </m:r>
+          <m:r>
+            <m:rPr>
+              <m:sty m:val="p"/>
+            </m:rPr>
+            <m:t>block</m:t>
+          </m:r>
           <m:d>
             <m:dPr>
               <m:begChr m:val="("/>
@@ -2118,32 +2317,26 @@
               <m:grow/>
             </m:dPr>
             <m:e>
-              <m:sSub>
-                <m:e>
-                  <m:r>
-                    <m:t>A</m:t>
-                  </m:r>
-                </m:e>
-                <m:sub>
-                  <m:r>
-                    <m:t>j</m:t>
-                  </m:r>
-                </m:sub>
-              </m:sSub>
-              <m:sSub>
-                <m:e>
-                  <m:r>
-                    <m:t>X</m:t>
-                  </m:r>
-                </m:e>
-                <m:sub>
-                  <m:r>
-                    <m:t>i</m:t>
-                  </m:r>
-                </m:sub>
-              </m:sSub>
+              <m:r>
+                <m:t>i</m:t>
+              </m:r>
             </m:e>
           </m:d>
+          <m:r>
+            <m:rPr>
+              <m:sty m:val="p"/>
+            </m:rPr>
+            <m:t>=</m:t>
+          </m:r>
+          <m:r>
+            <m:t>b</m:t>
+          </m:r>
+          <m:r>
+            <m:rPr>
+              <m:sty m:val="p"/>
+            </m:rPr>
+            <m:t>}</m:t>
+          </m:r>
           <m:r>
             <m:rPr>
               <m:sty m:val="p"/>
@@ -2153,15 +2346,12 @@
           <m:sSub>
             <m:e>
               <m:r>
-                <m:t>ε</m:t>
+                <m:t>u</m:t>
               </m:r>
             </m:e>
             <m:sub>
               <m:r>
                 <m:t>i</m:t>
-              </m:r>
-              <m:r>
-                <m:t>j</m:t>
               </m:r>
             </m:sub>
           </m:sSub>
@@ -2179,7 +2369,7 @@
         <w:pStyle w:val="FirstParagraph"/>
       </w:pPr>
       <w:r>
-        <w:t xml:space="preserve">X는 처치 전 정의한 정보 누락·비용비·수요 불확실성이다. 사례 고정효과 αᵢ에 흡수되는 X의 주효과를 중복해 넣지 않는다. 손실을 Y로 쓸 때 βAH&lt;0은 해당 설계에서 결합의 추가 손실 감소를 뜻한다. 전체 효과는 원래 측정 단위로, 비용비·누락·응답 조건별 차이는 사전에 정한 상호작용으로 보고한다.</w:t>
+        <w:t xml:space="preserve">반복 과제를 독립 참여자로 세지 않는다. 기본 128명은 참여자 평균의 0.5 표준편차 차이에 대해 양측 5%·약 80% 검정력을 가정한 계획 수다. 실제 사람의 분산과 경제적 최소 효과를 측정한 결과가 아니다. 모집 전 작은 목표를 정하면 탐색 파일럿으로 구분한다. 중단·누락이 있으면 배정 효과의 가능한 범위와 완료자 기술 통계를 제시하며 누락을 무시하는 p값은 계산하지 않는다.</w:t>
       </w:r>
     </w:p>
     <w:p>
@@ -2187,33 +2377,54 @@
         <w:pStyle w:val="BodyText"/>
       </w:pPr>
       <w:r>
-        <w:t xml:space="preserve">현재 first·no_value·고정 질문 경로도 신경망 구성기나 수요 GRU를 사용할 수 있으므로 비AI 기준선으로 이름만 바꾸지 않는다. 비AI 경로의 입력 범위·수요 추정·모수 구성·결측 처리와 Train 검증을 먼저 완료해야 한다. 전체 AI 묶음 효과와 모수 구성만 바꾸는 효과를 각각 구분한다.</w:t>
-      </w:r>
-    </w:p>
-    <w:p>
-      <w:pPr>
-        <w:pStyle w:val="BodyText"/>
-      </w:pPr>
-      <w:r>
-        <w:t xml:space="preserve">주 정보효과 실험은 관리자 기준 b를 모든 조건에 제공하고 사실 정보 획득을 비교한다. 선호 자체가 미선택인 사례는 별도 층으로 둔다. 질문 없는 조건이 정책상 발주를 할 수 없는 상황의 차이를 일반적인 인간–AI 보완성으로 해석하지 않는다. 비AI 기준선·새 출처·검정력 설계가 아직 준비되지 않았으므로 이 2×2 실험은</w:t>
+        <w:t xml:space="preserve">실제 사람 데이터는 아직 없다. 4명의 자동 브라우저 리허설은 기능 검사다. 과제는 생성한 고정 사례이며, 현재 AI는 새 수요 이력에서 과다 발주하는 사례가 있다. 그 제안을 정답으로 교정하지 않고 사용하므로 유익·영효과·악화가 모두 가능한 실험이다. 실제 조직·실무 매니저 전체로 일반화하지 않는다.</w:t>
       </w:r>
       <w:r>
         <w:t xml:space="preserve"> </w:t>
       </w:r>
-      <w:r>
-        <w:rPr>
-          <w:b/>
-          <w:bCs/>
-        </w:rPr>
-        <w:t xml:space="preserve">설계 단계이며 실행·사전등록 완료 상태가 아니다</w:t>
-      </w:r>
-      <w:r>
-        <w:t xml:space="preserve">.</w:t>
-      </w:r>
-    </w:p>
-    <w:bookmarkEnd w:id="32"/>
-    <w:bookmarkEnd w:id="33"/>
-    <w:bookmarkStart w:id="39" w:name="현재-모델과-검증된-범위"/>
+      <w:hyperlink r:id="rId34">
+        <w:r>
+          <w:rPr>
+            <w:rStyle w:val="Hyperlink"/>
+          </w:rPr>
+          <w:t xml:space="preserve">운영 안내와 Word</w:t>
+        </w:r>
+      </w:hyperlink>
+      <w:r>
+        <w:t xml:space="preserve">,</w:t>
+      </w:r>
+      <w:r>
+        <w:t xml:space="preserve"> </w:t>
+      </w:r>
+      <w:hyperlink r:id="rId35">
+        <w:r>
+          <w:rPr>
+            <w:rStyle w:val="Hyperlink"/>
+          </w:rPr>
+          <w:t xml:space="preserve">기계 판독 명세</w:t>
+        </w:r>
+      </w:hyperlink>
+      <w:r>
+        <w:t xml:space="preserve">,</w:t>
+      </w:r>
+      <w:r>
+        <w:t xml:space="preserve"> </w:t>
+      </w:r>
+      <w:hyperlink r:id="rId36">
+        <w:r>
+          <w:rPr>
+            <w:rStyle w:val="Hyperlink"/>
+          </w:rPr>
+          <w:t xml:space="preserve">준비 검증</w:t>
+        </w:r>
+      </w:hyperlink>
+      <w:r>
+        <w:t xml:space="preserve">에 모집·동의·접속·내보내기·분석 절차가 있다. 로컬 계획은 외부 사전등록이나 기관 승인을 뜻하지 않는다.</w:t>
+      </w:r>
+    </w:p>
+    <w:bookmarkEnd w:id="37"/>
+    <w:bookmarkEnd w:id="38"/>
+    <w:bookmarkStart w:id="44" w:name="현재-모델과-검증된-범위"/>
     <w:p>
       <w:pPr>
         <w:pStyle w:val="Heading2"/>
@@ -2351,7 +2562,7 @@
               <w:pStyle w:val="Compact"/>
             </w:pPr>
             <w:r>
-              <w:t xml:space="preserve">가중치를 고정한 L40S 구성 수정 비교 완료; 새 학습 효과와 구분</w:t>
+              <w:t xml:space="preserve">가중치를 고정한 L40S AI×질문 2×2 파일럿 완료; Train 616경로·Dev 6,720경로</w:t>
             </w:r>
           </w:p>
         </w:tc>
@@ -2532,7 +2743,7 @@
       <w:pPr>
         <w:pStyle w:val="BodyText"/>
       </w:pPr>
-      <w:hyperlink r:id="rId34">
+      <w:hyperlink r:id="rId39">
         <w:r>
           <w:rPr>
             <w:rStyle w:val="Hyperlink"/>
@@ -2546,7 +2757,7 @@
       <w:r>
         <w:t xml:space="preserve"> </w:t>
       </w:r>
-      <w:hyperlink r:id="rId35">
+      <w:hyperlink r:id="rId40">
         <w:r>
           <w:rPr>
             <w:rStyle w:val="Hyperlink"/>
@@ -2560,7 +2771,7 @@
       <w:r>
         <w:t xml:space="preserve"> </w:t>
       </w:r>
-      <w:hyperlink r:id="rId36">
+      <w:hyperlink r:id="rId41">
         <w:r>
           <w:rPr>
             <w:rStyle w:val="Hyperlink"/>
@@ -2574,7 +2785,7 @@
       <w:r>
         <w:t xml:space="preserve"> </w:t>
       </w:r>
-      <w:hyperlink r:id="rId37">
+      <w:hyperlink r:id="rId42">
         <w:r>
           <w:rPr>
             <w:rStyle w:val="Hyperlink"/>
@@ -2583,12 +2794,12 @@
         </w:r>
       </w:hyperlink>
       <w:r>
-        <w:t xml:space="preserve">를 참조한다. 위 수치는 과거 고정 측정이며 이번 문서 정리로 다시 측정하지 않았다. 새 탐색 회귀의 결과·자료 hash는</w:t>
+        <w:t xml:space="preserve">를 참조한다. 생성 Dev·판매 Dev·문서 혼입의 과거 수치는 기존 고정 측정이며 새 2×2의 주 분석과 분모가 다르다. 앞선 구성 수정 회귀의 결과·자료 hash는</w:t>
       </w:r>
       <w:r>
         <w:t xml:space="preserve"> </w:t>
       </w:r>
-      <w:hyperlink r:id="rId38">
+      <w:hyperlink r:id="rId43">
         <w:r>
           <w:rPr>
             <w:rStyle w:val="Hyperlink"/>
@@ -2597,6 +2808,20 @@
         </w:r>
       </w:hyperlink>
       <w:r>
+        <w:t xml:space="preserve">, 새 비AI 비교는</w:t>
+      </w:r>
+      <w:r>
+        <w:t xml:space="preserve"> </w:t>
+      </w:r>
+      <w:hyperlink r:id="rId32">
+        <w:r>
+          <w:rPr>
+            <w:rStyle w:val="Hyperlink"/>
+          </w:rPr>
+          <w:t xml:space="preserve">ai-comparison.md</w:t>
+        </w:r>
+      </w:hyperlink>
+      <w:r>
         <w:t xml:space="preserve">에 둔다.</w:t>
       </w:r>
     </w:p>
@@ -2608,8 +2833,8 @@
         <w:t xml:space="preserve">판매 336사례의 질문 지표와 35조건의 정확한 손실 분모를 섞지 않는다. 품절 판매를 잠재 수요로 대체하지 않는다. 문서 조건·응답 조합·seed의 반복은 독립 출처 수를 늘리지 않는다. 이미 동결 평가한 27개 출처도 새 확증 표본으로 재명명하지 않는다. 생성 문서·비용·응답의 성과를 실제 조직 효과로 주장하지 않는다.</w:t>
       </w:r>
     </w:p>
-    <w:bookmarkEnd w:id="39"/>
-    <w:bookmarkStart w:id="41" w:name="진행-순서와-완료-기준"/>
+    <w:bookmarkEnd w:id="44"/>
+    <w:bookmarkStart w:id="46" w:name="진행-순서와-완료-기준"/>
     <w:p>
       <w:pPr>
         <w:pStyle w:val="Heading2"/>
@@ -2627,7 +2852,7 @@
         </w:numPr>
       </w:pPr>
       <w:r>
-        <w:t xml:space="preserve">현재 연구 문서와 기존 구현·측정을 통합하고 위 이론과 식별 대상을 명시한다.</w:t>
+        <w:t xml:space="preserve">수리 모형·기존 측정을 통합하고 공개 Dev의 탐색 회귀와 수치 항등식 검증을 완료했다.</w:t>
       </w:r>
     </w:p>
     <w:p>
@@ -2639,7 +2864,7 @@
         </w:numPr>
       </w:pPr>
       <w:r>
-        <w:t xml:space="preserve">기존 공개 Dev를 사용한 탐색 회귀·출처 민감도·수치 항등식 검증을 실행해 재현 자료를 제공한다.</w:t>
+        <w:t xml:space="preserve">비AI 기준선의 관측 입력 구현·Train 검증과 공통 정책의 AI×질문 2×2 파일럿을 완료했다. 원시 경로와 160경로 독립 재현을 보존했다.</w:t>
       </w:r>
     </w:p>
     <w:p>
@@ -2651,7 +2876,7 @@
         </w:numPr>
       </w:pPr>
       <w:r>
-        <w:t xml:space="preserve">비AI 기준선을 관측 입력만으로 구현·Train 검증하고, 동일 입력·질문 정책·optimizer의 2×2 파일럿을 실행한다. 그 전에는 AI 도입 효과를 보고하지 않는다.</w:t>
+        <w:t xml:space="preserve">참여자 실험의 동의·무작위 배정·과제·저장·분석을 준비하고 소프트웨어 리허설을 완료했다. 모집 후 실제 사람의 자료를 수집한다.</w:t>
       </w:r>
     </w:p>
     <w:p>
@@ -2663,19 +2888,7 @@
         </w:numPr>
       </w:pPr>
       <w:r>
-        <w:t xml:space="preserve">독립적인 새 출처의 표본과 경제적으로 중요한 최소 효과를 정하고 검정력을 산정한다. 가설·제외 기준·측정 단위·군집·주 분석을 고정한 뒤 확증 실험을 수행한다.</w:t>
-      </w:r>
-    </w:p>
-    <w:p>
-      <w:pPr>
-        <w:pStyle w:val="Compact"/>
-        <w:numPr>
-          <w:ilvl w:val="0"/>
-          <w:numId w:val="1001"/>
-        </w:numPr>
-      </w:pPr>
-      <w:r>
-        <w:t xml:space="preserve">실제 사람의 판단 변화는 별도 참여자 실험으로 진행한다. 현재 코드의 응답 시뮬레이션으로 대체하지 않는다.</w:t>
+        <w:t xml:space="preserve">후속 확증에서는 독립적인 새 출처 또는 새로운 참여자·과제, 경제적으로 중요한 최소 효과, 표본·제외·분석계획을 고정한다. 개발에 쓴 Dev·기존 holdout·파일럿을 새로운 확증으로 재명명하지 않는다.</w:t>
       </w:r>
     </w:p>
     <w:p>
@@ -2688,7 +2901,7 @@
       <w:r>
         <w:t xml:space="preserve"> </w:t>
       </w:r>
-      <w:hyperlink r:id="rId40">
+      <w:hyperlink r:id="rId45">
         <w:r>
           <w:rPr>
             <w:rStyle w:val="Hyperlink"/>
@@ -2700,8 +2913,8 @@
         <w:t xml:space="preserve">에 보존한다.</w:t>
       </w:r>
     </w:p>
-    <w:bookmarkEnd w:id="41"/>
-    <w:bookmarkStart w:id="46" w:name="참고문헌"/>
+    <w:bookmarkEnd w:id="46"/>
+    <w:bookmarkStart w:id="52" w:name="참고문헌"/>
     <w:p>
       <w:pPr>
         <w:pStyle w:val="Heading2"/>
@@ -2739,7 +2952,7 @@
       <w:r>
         <w:t xml:space="preserve"> </w:t>
       </w:r>
-      <w:hyperlink r:id="rId42">
+      <w:hyperlink r:id="rId47">
         <w:r>
           <w:rPr>
             <w:rStyle w:val="Hyperlink"/>
@@ -2789,7 +3002,7 @@
       <w:r>
         <w:t xml:space="preserve"> </w:t>
       </w:r>
-      <w:hyperlink r:id="rId43">
+      <w:hyperlink r:id="rId48">
         <w:r>
           <w:rPr>
             <w:rStyle w:val="Hyperlink"/>
@@ -2830,7 +3043,7 @@
       <w:r>
         <w:t xml:space="preserve"> </w:t>
       </w:r>
-      <w:hyperlink r:id="rId44">
+      <w:hyperlink r:id="rId49">
         <w:r>
           <w:rPr>
             <w:rStyle w:val="Hyperlink"/>
@@ -2871,7 +3084,7 @@
       <w:r>
         <w:t xml:space="preserve"> </w:t>
       </w:r>
-      <w:hyperlink r:id="rId45">
+      <w:hyperlink r:id="rId50">
         <w:r>
           <w:rPr>
             <w:rStyle w:val="Hyperlink"/>
@@ -2883,8 +3096,49 @@
         <w:t xml:space="preserve">.</w:t>
       </w:r>
     </w:p>
-    <w:bookmarkEnd w:id="46"/>
-    <w:bookmarkEnd w:id="47"/>
+    <w:p>
+      <w:pPr>
+        <w:pStyle w:val="BodyText"/>
+      </w:pPr>
+      <w:r>
+        <w:t xml:space="preserve">[5] S. Noy and W. Zhang,</w:t>
+      </w:r>
+      <w:r>
+        <w:t xml:space="preserve"> </w:t>
+      </w:r>
+      <w:r>
+        <w:t xml:space="preserve">“Experimental evidence on the productivity effects of generative artificial intelligence,”</w:t>
+      </w:r>
+      <w:r>
+        <w:t xml:space="preserve"> </w:t>
+      </w:r>
+      <w:r>
+        <w:rPr>
+          <w:i/>
+          <w:iCs/>
+        </w:rPr>
+        <w:t xml:space="preserve">Science</w:t>
+      </w:r>
+      <w:r>
+        <w:t xml:space="preserve">, vol. 381, no. 6654, pp. 187–192, 2023.</w:t>
+      </w:r>
+      <w:r>
+        <w:t xml:space="preserve"> </w:t>
+      </w:r>
+      <w:hyperlink r:id="rId51">
+        <w:r>
+          <w:rPr>
+            <w:rStyle w:val="Hyperlink"/>
+          </w:rPr>
+          <w:t xml:space="preserve">doi:10.1126/science.adh2586</w:t>
+        </w:r>
+      </w:hyperlink>
+      <w:r>
+        <w:t xml:space="preserve">.</w:t>
+      </w:r>
+    </w:p>
+    <w:bookmarkEnd w:id="52"/>
+    <w:bookmarkEnd w:id="53"/>
     <w:sectPr>
       <w:footnotePr>
         <w:numRestart w:val="eachSect"/>

</xml_diff>